<commit_message>
docs: rapport PFE version finale (46 pages)
- Suppression de la page vide finale (47 -> 46 pages, fin sur le Glossaire)
- Liste des figures : Figure 2.1 corrigee (page 19)
- Liste des tableaux : Tableau 4.2 corrige (page 42)
- Conclusion : formulations affinees (contexte professionnel reel ; besoin identifie au debut du projet)

Co-Authored-By: Claude Sonnet 5 <noreply@anthropic.com>
</commit_message>
<xml_diff>
--- a/Rapport-PFE/Rapport_PFE_Bargaoui_Haythem.docx
+++ b/Rapport-PFE/Rapport_PFE_Bargaoui_Haythem.docx
@@ -805,7 +805,7 @@
         <w:pStyle w:val="Titre1"/>
         <w:jc w:val="center"/>
       </w:pPr>
-      <w:bookmarkStart w:id="0" w:name="_Toc237209504"/>
+      <w:bookmarkStart w:id="0" w:name="_Toc237210757"/>
       <w:r>
         <w:t>Table des matières</w:t>
       </w:r>
@@ -855,7 +855,7 @@
         <w:rPr>
           <w:noProof/>
         </w:rPr>
-        <w:instrText xml:space="preserve"> PAGEREF _Toc237209504 \h </w:instrText>
+        <w:instrText xml:space="preserve"> PAGEREF _Toc237210757 \h </w:instrText>
       </w:r>
       <w:r>
         <w:rPr>
@@ -916,7 +916,7 @@
         <w:rPr>
           <w:noProof/>
         </w:rPr>
-        <w:instrText xml:space="preserve"> PAGEREF _Toc237209505 \h </w:instrText>
+        <w:instrText xml:space="preserve"> PAGEREF _Toc237210758 \h </w:instrText>
       </w:r>
       <w:r>
         <w:rPr>
@@ -977,7 +977,7 @@
         <w:rPr>
           <w:noProof/>
         </w:rPr>
-        <w:instrText xml:space="preserve"> PAGEREF _Toc237209506 \h </w:instrText>
+        <w:instrText xml:space="preserve"> PAGEREF _Toc237210759 \h </w:instrText>
       </w:r>
       <w:r>
         <w:rPr>
@@ -1038,7 +1038,7 @@
         <w:rPr>
           <w:noProof/>
         </w:rPr>
-        <w:instrText xml:space="preserve"> PAGEREF _Toc237209507 \h </w:instrText>
+        <w:instrText xml:space="preserve"> PAGEREF _Toc237210760 \h </w:instrText>
       </w:r>
       <w:r>
         <w:rPr>
@@ -1099,7 +1099,7 @@
         <w:rPr>
           <w:noProof/>
         </w:rPr>
-        <w:instrText xml:space="preserve"> PAGEREF _Toc237209508 \h </w:instrText>
+        <w:instrText xml:space="preserve"> PAGEREF _Toc237210761 \h </w:instrText>
       </w:r>
       <w:r>
         <w:rPr>
@@ -1160,7 +1160,7 @@
         <w:rPr>
           <w:noProof/>
         </w:rPr>
-        <w:instrText xml:space="preserve"> PAGEREF _Toc237209509 \h </w:instrText>
+        <w:instrText xml:space="preserve"> PAGEREF _Toc237210762 \h </w:instrText>
       </w:r>
       <w:r>
         <w:rPr>
@@ -1221,7 +1221,7 @@
         <w:rPr>
           <w:noProof/>
         </w:rPr>
-        <w:instrText xml:space="preserve"> PAGEREF _Toc237209510 \h </w:instrText>
+        <w:instrText xml:space="preserve"> PAGEREF _Toc237210763 \h </w:instrText>
       </w:r>
       <w:r>
         <w:rPr>
@@ -1282,7 +1282,7 @@
         <w:rPr>
           <w:noProof/>
         </w:rPr>
-        <w:instrText xml:space="preserve"> PAGEREF _Toc237209511 \h </w:instrText>
+        <w:instrText xml:space="preserve"> PAGEREF _Toc237210764 \h </w:instrText>
       </w:r>
       <w:r>
         <w:rPr>
@@ -1343,7 +1343,7 @@
         <w:rPr>
           <w:noProof/>
         </w:rPr>
-        <w:instrText xml:space="preserve"> PAGEREF _Toc237209512 \h </w:instrText>
+        <w:instrText xml:space="preserve"> PAGEREF _Toc237210765 \h </w:instrText>
       </w:r>
       <w:r>
         <w:rPr>
@@ -1404,7 +1404,7 @@
         <w:rPr>
           <w:noProof/>
         </w:rPr>
-        <w:instrText xml:space="preserve"> PAGEREF _Toc237209513 \h </w:instrText>
+        <w:instrText xml:space="preserve"> PAGEREF _Toc237210766 \h </w:instrText>
       </w:r>
       <w:r>
         <w:rPr>
@@ -1465,7 +1465,7 @@
         <w:rPr>
           <w:noProof/>
         </w:rPr>
-        <w:instrText xml:space="preserve"> PAGEREF _Toc237209514 \h </w:instrText>
+        <w:instrText xml:space="preserve"> PAGEREF _Toc237210767 \h </w:instrText>
       </w:r>
       <w:r>
         <w:rPr>
@@ -1526,7 +1526,7 @@
         <w:rPr>
           <w:noProof/>
         </w:rPr>
-        <w:instrText xml:space="preserve"> PAGEREF _Toc237209515 \h </w:instrText>
+        <w:instrText xml:space="preserve"> PAGEREF _Toc237210768 \h </w:instrText>
       </w:r>
       <w:r>
         <w:rPr>
@@ -1587,7 +1587,7 @@
         <w:rPr>
           <w:noProof/>
         </w:rPr>
-        <w:instrText xml:space="preserve"> PAGEREF _Toc237209516 \h </w:instrText>
+        <w:instrText xml:space="preserve"> PAGEREF _Toc237210769 \h </w:instrText>
       </w:r>
       <w:r>
         <w:rPr>
@@ -1648,7 +1648,7 @@
         <w:rPr>
           <w:noProof/>
         </w:rPr>
-        <w:instrText xml:space="preserve"> PAGEREF _Toc237209517 \h </w:instrText>
+        <w:instrText xml:space="preserve"> PAGEREF _Toc237210770 \h </w:instrText>
       </w:r>
       <w:r>
         <w:rPr>
@@ -1709,7 +1709,7 @@
         <w:rPr>
           <w:noProof/>
         </w:rPr>
-        <w:instrText xml:space="preserve"> PAGEREF _Toc237209518 \h </w:instrText>
+        <w:instrText xml:space="preserve"> PAGEREF _Toc237210771 \h </w:instrText>
       </w:r>
       <w:r>
         <w:rPr>
@@ -1770,7 +1770,7 @@
         <w:rPr>
           <w:noProof/>
         </w:rPr>
-        <w:instrText xml:space="preserve"> PAGEREF _Toc237209519 \h </w:instrText>
+        <w:instrText xml:space="preserve"> PAGEREF _Toc237210772 \h </w:instrText>
       </w:r>
       <w:r>
         <w:rPr>
@@ -1831,7 +1831,7 @@
         <w:rPr>
           <w:noProof/>
         </w:rPr>
-        <w:instrText xml:space="preserve"> PAGEREF _Toc237209520 \h </w:instrText>
+        <w:instrText xml:space="preserve"> PAGEREF _Toc237210773 \h </w:instrText>
       </w:r>
       <w:r>
         <w:rPr>
@@ -1892,7 +1892,7 @@
         <w:rPr>
           <w:noProof/>
         </w:rPr>
-        <w:instrText xml:space="preserve"> PAGEREF _Toc237209521 \h </w:instrText>
+        <w:instrText xml:space="preserve"> PAGEREF _Toc237210774 \h </w:instrText>
       </w:r>
       <w:r>
         <w:rPr>
@@ -1953,7 +1953,7 @@
         <w:rPr>
           <w:noProof/>
         </w:rPr>
-        <w:instrText xml:space="preserve"> PAGEREF _Toc237209522 \h </w:instrText>
+        <w:instrText xml:space="preserve"> PAGEREF _Toc237210775 \h </w:instrText>
       </w:r>
       <w:r>
         <w:rPr>
@@ -2014,7 +2014,7 @@
         <w:rPr>
           <w:noProof/>
         </w:rPr>
-        <w:instrText xml:space="preserve"> PAGEREF _Toc237209523 \h </w:instrText>
+        <w:instrText xml:space="preserve"> PAGEREF _Toc237210776 \h </w:instrText>
       </w:r>
       <w:r>
         <w:rPr>
@@ -2075,7 +2075,7 @@
         <w:rPr>
           <w:noProof/>
         </w:rPr>
-        <w:instrText xml:space="preserve"> PAGEREF _Toc237209524 \h </w:instrText>
+        <w:instrText xml:space="preserve"> PAGEREF _Toc237210777 \h </w:instrText>
       </w:r>
       <w:r>
         <w:rPr>
@@ -2136,7 +2136,7 @@
         <w:rPr>
           <w:noProof/>
         </w:rPr>
-        <w:instrText xml:space="preserve"> PAGEREF _Toc237209525 \h </w:instrText>
+        <w:instrText xml:space="preserve"> PAGEREF _Toc237210778 \h </w:instrText>
       </w:r>
       <w:r>
         <w:rPr>
@@ -2197,7 +2197,7 @@
         <w:rPr>
           <w:noProof/>
         </w:rPr>
-        <w:instrText xml:space="preserve"> PAGEREF _Toc237209526 \h </w:instrText>
+        <w:instrText xml:space="preserve"> PAGEREF _Toc237210779 \h </w:instrText>
       </w:r>
       <w:r>
         <w:rPr>
@@ -2258,7 +2258,7 @@
         <w:rPr>
           <w:noProof/>
         </w:rPr>
-        <w:instrText xml:space="preserve"> PAGEREF _Toc237209527 \h </w:instrText>
+        <w:instrText xml:space="preserve"> PAGEREF _Toc237210780 \h </w:instrText>
       </w:r>
       <w:r>
         <w:rPr>
@@ -2275,7 +2275,7 @@
         <w:rPr>
           <w:noProof/>
         </w:rPr>
-        <w:t>20</w:t>
+        <w:t>19</w:t>
       </w:r>
       <w:r>
         <w:rPr>
@@ -2319,7 +2319,7 @@
         <w:rPr>
           <w:noProof/>
         </w:rPr>
-        <w:instrText xml:space="preserve"> PAGEREF _Toc237209528 \h </w:instrText>
+        <w:instrText xml:space="preserve"> PAGEREF _Toc237210781 \h </w:instrText>
       </w:r>
       <w:r>
         <w:rPr>
@@ -2380,7 +2380,7 @@
         <w:rPr>
           <w:noProof/>
         </w:rPr>
-        <w:instrText xml:space="preserve"> PAGEREF _Toc237209529 \h </w:instrText>
+        <w:instrText xml:space="preserve"> PAGEREF _Toc237210782 \h </w:instrText>
       </w:r>
       <w:r>
         <w:rPr>
@@ -2397,7 +2397,7 @@
         <w:rPr>
           <w:noProof/>
         </w:rPr>
-        <w:t>21</w:t>
+        <w:t>20</w:t>
       </w:r>
       <w:r>
         <w:rPr>
@@ -2441,7 +2441,7 @@
         <w:rPr>
           <w:noProof/>
         </w:rPr>
-        <w:instrText xml:space="preserve"> PAGEREF _Toc237209530 \h </w:instrText>
+        <w:instrText xml:space="preserve"> PAGEREF _Toc237210783 \h </w:instrText>
       </w:r>
       <w:r>
         <w:rPr>
@@ -2458,7 +2458,7 @@
         <w:rPr>
           <w:noProof/>
         </w:rPr>
-        <w:t>21</w:t>
+        <w:t>20</w:t>
       </w:r>
       <w:r>
         <w:rPr>
@@ -2502,7 +2502,7 @@
         <w:rPr>
           <w:noProof/>
         </w:rPr>
-        <w:instrText xml:space="preserve"> PAGEREF _Toc237209531 \h </w:instrText>
+        <w:instrText xml:space="preserve"> PAGEREF _Toc237210784 \h </w:instrText>
       </w:r>
       <w:r>
         <w:rPr>
@@ -2563,7 +2563,7 @@
         <w:rPr>
           <w:noProof/>
         </w:rPr>
-        <w:instrText xml:space="preserve"> PAGEREF _Toc237209532 \h </w:instrText>
+        <w:instrText xml:space="preserve"> PAGEREF _Toc237210785 \h </w:instrText>
       </w:r>
       <w:r>
         <w:rPr>
@@ -2624,7 +2624,7 @@
         <w:rPr>
           <w:noProof/>
         </w:rPr>
-        <w:instrText xml:space="preserve"> PAGEREF _Toc237209533 \h </w:instrText>
+        <w:instrText xml:space="preserve"> PAGEREF _Toc237210786 \h </w:instrText>
       </w:r>
       <w:r>
         <w:rPr>
@@ -2685,7 +2685,7 @@
         <w:rPr>
           <w:noProof/>
         </w:rPr>
-        <w:instrText xml:space="preserve"> PAGEREF _Toc237209534 \h </w:instrText>
+        <w:instrText xml:space="preserve"> PAGEREF _Toc237210787 \h </w:instrText>
       </w:r>
       <w:r>
         <w:rPr>
@@ -2746,7 +2746,7 @@
         <w:rPr>
           <w:noProof/>
         </w:rPr>
-        <w:instrText xml:space="preserve"> PAGEREF _Toc237209535 \h </w:instrText>
+        <w:instrText xml:space="preserve"> PAGEREF _Toc237210788 \h </w:instrText>
       </w:r>
       <w:r>
         <w:rPr>
@@ -2807,7 +2807,7 @@
         <w:rPr>
           <w:noProof/>
         </w:rPr>
-        <w:instrText xml:space="preserve"> PAGEREF _Toc237209536 \h </w:instrText>
+        <w:instrText xml:space="preserve"> PAGEREF _Toc237210789 \h </w:instrText>
       </w:r>
       <w:r>
         <w:rPr>
@@ -2868,7 +2868,7 @@
         <w:rPr>
           <w:noProof/>
         </w:rPr>
-        <w:instrText xml:space="preserve"> PAGEREF _Toc237209537 \h </w:instrText>
+        <w:instrText xml:space="preserve"> PAGEREF _Toc237210790 \h </w:instrText>
       </w:r>
       <w:r>
         <w:rPr>
@@ -2929,7 +2929,7 @@
         <w:rPr>
           <w:noProof/>
         </w:rPr>
-        <w:instrText xml:space="preserve"> PAGEREF _Toc237209538 \h </w:instrText>
+        <w:instrText xml:space="preserve"> PAGEREF _Toc237210791 \h </w:instrText>
       </w:r>
       <w:r>
         <w:rPr>
@@ -2990,7 +2990,7 @@
         <w:rPr>
           <w:noProof/>
         </w:rPr>
-        <w:instrText xml:space="preserve"> PAGEREF _Toc237209539 \h </w:instrText>
+        <w:instrText xml:space="preserve"> PAGEREF _Toc237210792 \h </w:instrText>
       </w:r>
       <w:r>
         <w:rPr>
@@ -3051,7 +3051,7 @@
         <w:rPr>
           <w:noProof/>
         </w:rPr>
-        <w:instrText xml:space="preserve"> PAGEREF _Toc237209540 \h </w:instrText>
+        <w:instrText xml:space="preserve"> PAGEREF _Toc237210793 \h </w:instrText>
       </w:r>
       <w:r>
         <w:rPr>
@@ -3112,7 +3112,7 @@
         <w:rPr>
           <w:noProof/>
         </w:rPr>
-        <w:instrText xml:space="preserve"> PAGEREF _Toc237209541 \h </w:instrText>
+        <w:instrText xml:space="preserve"> PAGEREF _Toc237210794 \h </w:instrText>
       </w:r>
       <w:r>
         <w:rPr>
@@ -3173,7 +3173,7 @@
         <w:rPr>
           <w:noProof/>
         </w:rPr>
-        <w:instrText xml:space="preserve"> PAGEREF _Toc237209542 \h </w:instrText>
+        <w:instrText xml:space="preserve"> PAGEREF _Toc237210795 \h </w:instrText>
       </w:r>
       <w:r>
         <w:rPr>
@@ -3234,7 +3234,7 @@
         <w:rPr>
           <w:noProof/>
         </w:rPr>
-        <w:instrText xml:space="preserve"> PAGEREF _Toc237209543 \h </w:instrText>
+        <w:instrText xml:space="preserve"> PAGEREF _Toc237210796 \h </w:instrText>
       </w:r>
       <w:r>
         <w:rPr>
@@ -3295,7 +3295,7 @@
         <w:rPr>
           <w:noProof/>
         </w:rPr>
-        <w:instrText xml:space="preserve"> PAGEREF _Toc237209544 \h </w:instrText>
+        <w:instrText xml:space="preserve"> PAGEREF _Toc237210797 \h </w:instrText>
       </w:r>
       <w:r>
         <w:rPr>
@@ -3356,7 +3356,7 @@
         <w:rPr>
           <w:noProof/>
         </w:rPr>
-        <w:instrText xml:space="preserve"> PAGEREF _Toc237209545 \h </w:instrText>
+        <w:instrText xml:space="preserve"> PAGEREF _Toc237210798 \h </w:instrText>
       </w:r>
       <w:r>
         <w:rPr>
@@ -3417,7 +3417,7 @@
         <w:rPr>
           <w:noProof/>
         </w:rPr>
-        <w:instrText xml:space="preserve"> PAGEREF _Toc237209546 \h </w:instrText>
+        <w:instrText xml:space="preserve"> PAGEREF _Toc237210799 \h </w:instrText>
       </w:r>
       <w:r>
         <w:rPr>
@@ -3478,7 +3478,7 @@
         <w:rPr>
           <w:noProof/>
         </w:rPr>
-        <w:instrText xml:space="preserve"> PAGEREF _Toc237209547 \h </w:instrText>
+        <w:instrText xml:space="preserve"> PAGEREF _Toc237210800 \h </w:instrText>
       </w:r>
       <w:r>
         <w:rPr>
@@ -3539,7 +3539,7 @@
         <w:rPr>
           <w:noProof/>
         </w:rPr>
-        <w:instrText xml:space="preserve"> PAGEREF _Toc237209548 \h </w:instrText>
+        <w:instrText xml:space="preserve"> PAGEREF _Toc237210801 \h </w:instrText>
       </w:r>
       <w:r>
         <w:rPr>
@@ -3600,7 +3600,7 @@
         <w:rPr>
           <w:noProof/>
         </w:rPr>
-        <w:instrText xml:space="preserve"> PAGEREF _Toc237209549 \h </w:instrText>
+        <w:instrText xml:space="preserve"> PAGEREF _Toc237210802 \h </w:instrText>
       </w:r>
       <w:r>
         <w:rPr>
@@ -3661,7 +3661,7 @@
         <w:rPr>
           <w:noProof/>
         </w:rPr>
-        <w:instrText xml:space="preserve"> PAGEREF _Toc237209550 \h </w:instrText>
+        <w:instrText xml:space="preserve"> PAGEREF _Toc237210803 \h </w:instrText>
       </w:r>
       <w:r>
         <w:rPr>
@@ -3722,7 +3722,7 @@
         <w:rPr>
           <w:noProof/>
         </w:rPr>
-        <w:instrText xml:space="preserve"> PAGEREF _Toc237209551 \h </w:instrText>
+        <w:instrText xml:space="preserve"> PAGEREF _Toc237210804 \h </w:instrText>
       </w:r>
       <w:r>
         <w:rPr>
@@ -3783,7 +3783,7 @@
         <w:rPr>
           <w:noProof/>
         </w:rPr>
-        <w:instrText xml:space="preserve"> PAGEREF _Toc237209552 \h </w:instrText>
+        <w:instrText xml:space="preserve"> PAGEREF _Toc237210805 \h </w:instrText>
       </w:r>
       <w:r>
         <w:rPr>
@@ -3844,7 +3844,7 @@
         <w:rPr>
           <w:noProof/>
         </w:rPr>
-        <w:instrText xml:space="preserve"> PAGEREF _Toc237209553 \h </w:instrText>
+        <w:instrText xml:space="preserve"> PAGEREF _Toc237210806 \h </w:instrText>
       </w:r>
       <w:r>
         <w:rPr>
@@ -3905,7 +3905,7 @@
         <w:rPr>
           <w:noProof/>
         </w:rPr>
-        <w:instrText xml:space="preserve"> PAGEREF _Toc237209554 \h </w:instrText>
+        <w:instrText xml:space="preserve"> PAGEREF _Toc237210807 \h </w:instrText>
       </w:r>
       <w:r>
         <w:rPr>
@@ -3966,7 +3966,7 @@
         <w:rPr>
           <w:noProof/>
         </w:rPr>
-        <w:instrText xml:space="preserve"> PAGEREF _Toc237209555 \h </w:instrText>
+        <w:instrText xml:space="preserve"> PAGEREF _Toc237210808 \h </w:instrText>
       </w:r>
       <w:r>
         <w:rPr>
@@ -4027,7 +4027,7 @@
         <w:rPr>
           <w:noProof/>
         </w:rPr>
-        <w:instrText xml:space="preserve"> PAGEREF _Toc237209556 \h </w:instrText>
+        <w:instrText xml:space="preserve"> PAGEREF _Toc237210809 \h </w:instrText>
       </w:r>
       <w:r>
         <w:rPr>
@@ -4088,7 +4088,7 @@
         <w:rPr>
           <w:noProof/>
         </w:rPr>
-        <w:instrText xml:space="preserve"> PAGEREF _Toc237209557 \h </w:instrText>
+        <w:instrText xml:space="preserve"> PAGEREF _Toc237210810 \h </w:instrText>
       </w:r>
       <w:r>
         <w:rPr>
@@ -4149,7 +4149,7 @@
         <w:rPr>
           <w:noProof/>
         </w:rPr>
-        <w:instrText xml:space="preserve"> PAGEREF _Toc237209558 \h </w:instrText>
+        <w:instrText xml:space="preserve"> PAGEREF _Toc237210811 \h </w:instrText>
       </w:r>
       <w:r>
         <w:rPr>
@@ -4210,7 +4210,7 @@
         <w:rPr>
           <w:noProof/>
         </w:rPr>
-        <w:instrText xml:space="preserve"> PAGEREF _Toc237209559 \h </w:instrText>
+        <w:instrText xml:space="preserve"> PAGEREF _Toc237210812 \h </w:instrText>
       </w:r>
       <w:r>
         <w:rPr>
@@ -4271,7 +4271,7 @@
         <w:rPr>
           <w:noProof/>
         </w:rPr>
-        <w:instrText xml:space="preserve"> PAGEREF _Toc237209560 \h </w:instrText>
+        <w:instrText xml:space="preserve"> PAGEREF _Toc237210813 \h </w:instrText>
       </w:r>
       <w:r>
         <w:rPr>
@@ -4332,7 +4332,7 @@
         <w:rPr>
           <w:noProof/>
         </w:rPr>
-        <w:instrText xml:space="preserve"> PAGEREF _Toc237209561 \h </w:instrText>
+        <w:instrText xml:space="preserve"> PAGEREF _Toc237210814 \h </w:instrText>
       </w:r>
       <w:r>
         <w:rPr>
@@ -4393,7 +4393,7 @@
         <w:rPr>
           <w:noProof/>
         </w:rPr>
-        <w:instrText xml:space="preserve"> PAGEREF _Toc237209562 \h </w:instrText>
+        <w:instrText xml:space="preserve"> PAGEREF _Toc237210815 \h </w:instrText>
       </w:r>
       <w:r>
         <w:rPr>
@@ -4454,7 +4454,7 @@
         <w:rPr>
           <w:noProof/>
         </w:rPr>
-        <w:instrText xml:space="preserve"> PAGEREF _Toc237209563 \h </w:instrText>
+        <w:instrText xml:space="preserve"> PAGEREF _Toc237210816 \h </w:instrText>
       </w:r>
       <w:r>
         <w:rPr>
@@ -4515,7 +4515,7 @@
         <w:rPr>
           <w:noProof/>
         </w:rPr>
-        <w:instrText xml:space="preserve"> PAGEREF _Toc237209564 \h </w:instrText>
+        <w:instrText xml:space="preserve"> PAGEREF _Toc237210817 \h </w:instrText>
       </w:r>
       <w:r>
         <w:rPr>
@@ -4576,7 +4576,7 @@
         <w:rPr>
           <w:noProof/>
         </w:rPr>
-        <w:instrText xml:space="preserve"> PAGEREF _Toc237209565 \h </w:instrText>
+        <w:instrText xml:space="preserve"> PAGEREF _Toc237210818 \h </w:instrText>
       </w:r>
       <w:r>
         <w:rPr>
@@ -4637,7 +4637,7 @@
         <w:rPr>
           <w:noProof/>
         </w:rPr>
-        <w:instrText xml:space="preserve"> PAGEREF _Toc237209566 \h </w:instrText>
+        <w:instrText xml:space="preserve"> PAGEREF _Toc237210819 \h </w:instrText>
       </w:r>
       <w:r>
         <w:rPr>
@@ -4698,7 +4698,7 @@
         <w:rPr>
           <w:noProof/>
         </w:rPr>
-        <w:instrText xml:space="preserve"> PAGEREF _Toc237209567 \h </w:instrText>
+        <w:instrText xml:space="preserve"> PAGEREF _Toc237210820 \h </w:instrText>
       </w:r>
       <w:r>
         <w:rPr>
@@ -4759,7 +4759,7 @@
         <w:rPr>
           <w:noProof/>
         </w:rPr>
-        <w:instrText xml:space="preserve"> PAGEREF _Toc237209568 \h </w:instrText>
+        <w:instrText xml:space="preserve"> PAGEREF _Toc237210821 \h </w:instrText>
       </w:r>
       <w:r>
         <w:rPr>
@@ -4820,7 +4820,7 @@
         <w:rPr>
           <w:noProof/>
         </w:rPr>
-        <w:instrText xml:space="preserve"> PAGEREF _Toc237209569 \h </w:instrText>
+        <w:instrText xml:space="preserve"> PAGEREF _Toc237210822 \h </w:instrText>
       </w:r>
       <w:r>
         <w:rPr>
@@ -4881,7 +4881,7 @@
         <w:rPr>
           <w:noProof/>
         </w:rPr>
-        <w:instrText xml:space="preserve"> PAGEREF _Toc237209570 \h </w:instrText>
+        <w:instrText xml:space="preserve"> PAGEREF _Toc237210823 \h </w:instrText>
       </w:r>
       <w:r>
         <w:rPr>
@@ -4942,7 +4942,7 @@
         <w:rPr>
           <w:noProof/>
         </w:rPr>
-        <w:instrText xml:space="preserve"> PAGEREF _Toc237209571 \h </w:instrText>
+        <w:instrText xml:space="preserve"> PAGEREF _Toc237210824 \h </w:instrText>
       </w:r>
       <w:r>
         <w:rPr>
@@ -5003,7 +5003,7 @@
         <w:rPr>
           <w:noProof/>
         </w:rPr>
-        <w:instrText xml:space="preserve"> PAGEREF _Toc237209572 \h </w:instrText>
+        <w:instrText xml:space="preserve"> PAGEREF _Toc237210825 \h </w:instrText>
       </w:r>
       <w:r>
         <w:rPr>
@@ -5064,7 +5064,7 @@
         <w:rPr>
           <w:noProof/>
         </w:rPr>
-        <w:instrText xml:space="preserve"> PAGEREF _Toc237209573 \h </w:instrText>
+        <w:instrText xml:space="preserve"> PAGEREF _Toc237210826 \h </w:instrText>
       </w:r>
       <w:r>
         <w:rPr>
@@ -5107,7 +5107,7 @@
       <w:pPr>
         <w:pStyle w:val="Titre1"/>
       </w:pPr>
-      <w:bookmarkStart w:id="1" w:name="_Toc237209505"/>
+      <w:bookmarkStart w:id="1" w:name="_Toc237210758"/>
       <w:r>
         <w:t>Liste des figures</w:t>
       </w:r>
@@ -5120,11 +5120,14 @@
         </w:tabs>
       </w:pPr>
       <w:r>
-        <w:t>Figure 2.1 : Diagramme de cas d'utilisation global</w:t>
+        <w:t xml:space="preserve">Figure 2.1 : Diagramme de </w:t>
+      </w:r>
+      <w:r>
+        <w:t>cas d’utilisation global</w:t>
       </w:r>
       <w:r>
         <w:tab/>
-        <w:t>20</w:t>
+        <w:t>19</w:t>
       </w:r>
     </w:p>
     <w:p>
@@ -5433,7 +5436,7 @@
       <w:pPr>
         <w:pStyle w:val="Titre1"/>
       </w:pPr>
-      <w:bookmarkStart w:id="2" w:name="_Toc237209506"/>
+      <w:bookmarkStart w:id="2" w:name="_Toc237210759"/>
       <w:r>
         <w:t>Liste des tableaux</w:t>
       </w:r>
@@ -5474,11 +5477,14 @@
         </w:tabs>
       </w:pPr>
       <w:r>
-        <w:t>Tableau 4.2 : Bilan des fonctionnalités réalisées</w:t>
+        <w:t xml:space="preserve">Tableau 4.2 : </w:t>
+      </w:r>
+      <w:r>
+        <w:t>Bilan des fonctionnalités réalisées</w:t>
       </w:r>
       <w:r>
         <w:tab/>
-        <w:t>41</w:t>
+        <w:t>42</w:t>
       </w:r>
     </w:p>
     <w:p>
@@ -5494,7 +5500,7 @@
         <w:pStyle w:val="Titre1"/>
         <w:jc w:val="center"/>
       </w:pPr>
-      <w:bookmarkStart w:id="3" w:name="_Toc237209507"/>
+      <w:bookmarkStart w:id="3" w:name="_Toc237210760"/>
       <w:r>
         <w:t>Introduction Générale</w:t>
       </w:r>
@@ -5527,7 +5533,7 @@
       <w:pPr>
         <w:pStyle w:val="Titre1"/>
       </w:pPr>
-      <w:bookmarkStart w:id="4" w:name="_Toc237209508"/>
+      <w:bookmarkStart w:id="4" w:name="_Toc237210761"/>
       <w:r>
         <w:t>Chapitre 1 : Cadre Général du Projet</w:t>
       </w:r>
@@ -5542,7 +5548,7 @@
       <w:pPr>
         <w:pStyle w:val="Titre2"/>
       </w:pPr>
-      <w:bookmarkStart w:id="5" w:name="_Toc237209509"/>
+      <w:bookmarkStart w:id="5" w:name="_Toc237210762"/>
       <w:r>
         <w:t>1.1 Introduction</w:t>
       </w:r>
@@ -5557,7 +5563,7 @@
       <w:pPr>
         <w:pStyle w:val="Titre2"/>
       </w:pPr>
-      <w:bookmarkStart w:id="6" w:name="_Toc237209510"/>
+      <w:bookmarkStart w:id="6" w:name="_Toc237210763"/>
       <w:r>
         <w:t>1.2 Présentation de l'organisme d'accueil</w:t>
       </w:r>
@@ -5567,7 +5573,7 @@
       <w:pPr>
         <w:pStyle w:val="Titre3"/>
       </w:pPr>
-      <w:bookmarkStart w:id="7" w:name="_Toc237209511"/>
+      <w:bookmarkStart w:id="7" w:name="_Toc237210764"/>
       <w:r>
         <w:t>1.2.1 Le groupe Sopra Steria</w:t>
       </w:r>
@@ -5582,7 +5588,7 @@
       <w:pPr>
         <w:pStyle w:val="Titre3"/>
       </w:pPr>
-      <w:bookmarkStart w:id="8" w:name="_Toc237209512"/>
+      <w:bookmarkStart w:id="8" w:name="_Toc237210765"/>
       <w:r>
         <w:t>1.2.2 Sopra HR Software</w:t>
       </w:r>
@@ -5602,7 +5608,7 @@
       <w:pPr>
         <w:pStyle w:val="Titre2"/>
       </w:pPr>
-      <w:bookmarkStart w:id="9" w:name="_Toc237209513"/>
+      <w:bookmarkStart w:id="9" w:name="_Toc237210766"/>
       <w:r>
         <w:t>1.3 Étude de l'existant</w:t>
       </w:r>
@@ -5689,7 +5695,7 @@
       <w:pPr>
         <w:pStyle w:val="Titre2"/>
       </w:pPr>
-      <w:bookmarkStart w:id="10" w:name="_Toc237209514"/>
+      <w:bookmarkStart w:id="10" w:name="_Toc237210767"/>
       <w:r>
         <w:t>1.4 Critique de l'existant et problématique</w:t>
       </w:r>
@@ -5709,7 +5715,7 @@
       <w:pPr>
         <w:pStyle w:val="Titre2"/>
       </w:pPr>
-      <w:bookmarkStart w:id="11" w:name="_Toc237209515"/>
+      <w:bookmarkStart w:id="11" w:name="_Toc237210768"/>
       <w:r>
         <w:t>1.5 Objectifs du projet</w:t>
       </w:r>
@@ -5796,7 +5802,7 @@
       <w:pPr>
         <w:pStyle w:val="Titre2"/>
       </w:pPr>
-      <w:bookmarkStart w:id="12" w:name="_Toc237209516"/>
+      <w:bookmarkStart w:id="12" w:name="_Toc237210769"/>
       <w:r>
         <w:t>1.6 Présentation de la solution proposée : JOB4YOU</w:t>
       </w:r>
@@ -5864,7 +5870,7 @@
       <w:pPr>
         <w:pStyle w:val="Titre2"/>
       </w:pPr>
-      <w:bookmarkStart w:id="13" w:name="_Toc237209517"/>
+      <w:bookmarkStart w:id="13" w:name="_Toc237210770"/>
       <w:r>
         <w:t>1.7 Méthodologie de travail adoptée</w:t>
       </w:r>
@@ -5884,7 +5890,7 @@
       <w:pPr>
         <w:pStyle w:val="Titre2"/>
       </w:pPr>
-      <w:bookmarkStart w:id="14" w:name="_Toc237209518"/>
+      <w:bookmarkStart w:id="14" w:name="_Toc237210771"/>
       <w:r>
         <w:t>1.8 Planification du projet</w:t>
       </w:r>
@@ -6272,7 +6278,7 @@
       <w:pPr>
         <w:pStyle w:val="Titre2"/>
       </w:pPr>
-      <w:bookmarkStart w:id="15" w:name="_Toc237209519"/>
+      <w:bookmarkStart w:id="15" w:name="_Toc237210772"/>
       <w:r>
         <w:t>1.9 Conclusion</w:t>
       </w:r>
@@ -6295,7 +6301,7 @@
       <w:pPr>
         <w:pStyle w:val="Titre1"/>
       </w:pPr>
-      <w:bookmarkStart w:id="16" w:name="_Toc237209520"/>
+      <w:bookmarkStart w:id="16" w:name="_Toc237210773"/>
       <w:r>
         <w:t>Chapitre 2 : Analyse et Spécification des Besoins</w:t>
       </w:r>
@@ -6310,7 +6316,7 @@
       <w:pPr>
         <w:pStyle w:val="Titre2"/>
       </w:pPr>
-      <w:bookmarkStart w:id="17" w:name="_Toc237209521"/>
+      <w:bookmarkStart w:id="17" w:name="_Toc237210774"/>
       <w:r>
         <w:t>2.1 Introduction</w:t>
       </w:r>
@@ -6325,7 +6331,7 @@
       <w:pPr>
         <w:pStyle w:val="Titre2"/>
       </w:pPr>
-      <w:bookmarkStart w:id="18" w:name="_Toc237209522"/>
+      <w:bookmarkStart w:id="18" w:name="_Toc237210775"/>
       <w:r>
         <w:t>2.2 Étude fonctionnelle</w:t>
       </w:r>
@@ -6335,7 +6341,7 @@
       <w:pPr>
         <w:pStyle w:val="Titre3"/>
       </w:pPr>
-      <w:bookmarkStart w:id="19" w:name="_Toc237209523"/>
+      <w:bookmarkStart w:id="19" w:name="_Toc237210776"/>
       <w:r>
         <w:t>2.2.1 Identification des acteurs du système</w:t>
       </w:r>
@@ -7296,7 +7302,7 @@
       <w:pPr>
         <w:pStyle w:val="Titre3"/>
       </w:pPr>
-      <w:bookmarkStart w:id="20" w:name="_Toc237209524"/>
+      <w:bookmarkStart w:id="20" w:name="_Toc237210777"/>
       <w:r>
         <w:t>2.2.2 Identification des besoins fonctionnels</w:t>
       </w:r>
@@ -7443,7 +7449,7 @@
       <w:pPr>
         <w:pStyle w:val="Titre3"/>
       </w:pPr>
-      <w:bookmarkStart w:id="21" w:name="_Toc237209525"/>
+      <w:bookmarkStart w:id="21" w:name="_Toc237210778"/>
       <w:r>
         <w:t>2.2.3 Identification des besoins non fonctionnels</w:t>
       </w:r>
@@ -7530,7 +7536,7 @@
       <w:pPr>
         <w:pStyle w:val="Titre3"/>
       </w:pPr>
-      <w:bookmarkStart w:id="22" w:name="_Toc237209526"/>
+      <w:bookmarkStart w:id="22" w:name="_Toc237210779"/>
       <w:r>
         <w:t>2.2.4 Diagramme de cas d'utilisation</w:t>
       </w:r>
@@ -7579,7 +7585,7 @@
       <w:pPr>
         <w:pStyle w:val="Titre3"/>
       </w:pPr>
-      <w:bookmarkStart w:id="23" w:name="_Toc237209527"/>
+      <w:bookmarkStart w:id="23" w:name="_Toc237210780"/>
       <w:r>
         <w:t>2.2.5 Description textuelle de quelques cas d'utilisation</w:t>
       </w:r>
@@ -7966,7 +7972,7 @@
       <w:pPr>
         <w:pStyle w:val="Titre3"/>
       </w:pPr>
-      <w:bookmarkStart w:id="24" w:name="_Toc237209528"/>
+      <w:bookmarkStart w:id="24" w:name="_Toc237210781"/>
       <w:r>
         <w:t>2.2.6 Diagramme de séquence système</w:t>
       </w:r>
@@ -8013,7 +8019,7 @@
       <w:pPr>
         <w:pStyle w:val="Titre2"/>
       </w:pPr>
-      <w:bookmarkStart w:id="25" w:name="_Toc237209529"/>
+      <w:bookmarkStart w:id="25" w:name="_Toc237210782"/>
       <w:r>
         <w:t>2.3 Étude technique</w:t>
       </w:r>
@@ -8023,7 +8029,7 @@
       <w:pPr>
         <w:pStyle w:val="Titre3"/>
       </w:pPr>
-      <w:bookmarkStart w:id="26" w:name="_Toc237209530"/>
+      <w:bookmarkStart w:id="26" w:name="_Toc237210783"/>
       <w:r>
         <w:t>2.3.1 Architecture physique</w:t>
       </w:r>
@@ -8070,7 +8076,7 @@
       <w:pPr>
         <w:pStyle w:val="Titre3"/>
       </w:pPr>
-      <w:bookmarkStart w:id="27" w:name="_Toc237209531"/>
+      <w:bookmarkStart w:id="27" w:name="_Toc237210784"/>
       <w:r>
         <w:t>2.3.2 Côté client — Angular</w:t>
       </w:r>
@@ -8085,7 +8091,7 @@
       <w:pPr>
         <w:pStyle w:val="Titre3"/>
       </w:pPr>
-      <w:bookmarkStart w:id="28" w:name="_Toc237209532"/>
+      <w:bookmarkStart w:id="28" w:name="_Toc237210785"/>
       <w:r>
         <w:t>2.3.3 Côté serveur — Spring Boot</w:t>
       </w:r>
@@ -8100,7 +8106,7 @@
       <w:pPr>
         <w:pStyle w:val="Titre3"/>
       </w:pPr>
-      <w:bookmarkStart w:id="29" w:name="_Toc237209533"/>
+      <w:bookmarkStart w:id="29" w:name="_Toc237210786"/>
       <w:r>
         <w:t>2.3.4 La sécurité — Spring Security et JWT</w:t>
       </w:r>
@@ -8115,7 +8121,7 @@
       <w:pPr>
         <w:pStyle w:val="Titre2"/>
       </w:pPr>
-      <w:bookmarkStart w:id="30" w:name="_Toc237209534"/>
+      <w:bookmarkStart w:id="30" w:name="_Toc237210787"/>
       <w:r>
         <w:t>2.4 Conclusion</w:t>
       </w:r>
@@ -8138,7 +8144,7 @@
       <w:pPr>
         <w:pStyle w:val="Titre1"/>
       </w:pPr>
-      <w:bookmarkStart w:id="31" w:name="_Toc237209535"/>
+      <w:bookmarkStart w:id="31" w:name="_Toc237210788"/>
       <w:r>
         <w:t>Chapitre 3 : Conception</w:t>
       </w:r>
@@ -8153,7 +8159,7 @@
       <w:pPr>
         <w:pStyle w:val="Titre2"/>
       </w:pPr>
-      <w:bookmarkStart w:id="32" w:name="_Toc237209536"/>
+      <w:bookmarkStart w:id="32" w:name="_Toc237210789"/>
       <w:r>
         <w:t>3.1 Introduction</w:t>
       </w:r>
@@ -8168,7 +8174,7 @@
       <w:pPr>
         <w:pStyle w:val="Titre2"/>
       </w:pPr>
-      <w:bookmarkStart w:id="33" w:name="_Toc237209537"/>
+      <w:bookmarkStart w:id="33" w:name="_Toc237210790"/>
       <w:r>
         <w:t>3.2 Diagramme des paquetages</w:t>
       </w:r>
@@ -8220,7 +8226,7 @@
       <w:pPr>
         <w:pStyle w:val="Titre2"/>
       </w:pPr>
-      <w:bookmarkStart w:id="34" w:name="_Toc237209538"/>
+      <w:bookmarkStart w:id="34" w:name="_Toc237210791"/>
       <w:r>
         <w:t>3.3 Diagramme de classes global</w:t>
       </w:r>
@@ -8299,7 +8305,7 @@
       <w:pPr>
         <w:pStyle w:val="Titre2"/>
       </w:pPr>
-      <w:bookmarkStart w:id="35" w:name="_Toc237209539"/>
+      <w:bookmarkStart w:id="35" w:name="_Toc237210792"/>
       <w:r>
         <w:t>3.4 Diagrammes de séquence objet</w:t>
       </w:r>
@@ -8314,7 +8320,7 @@
       <w:pPr>
         <w:pStyle w:val="Titre3"/>
       </w:pPr>
-      <w:bookmarkStart w:id="36" w:name="_Toc237209540"/>
+      <w:bookmarkStart w:id="36" w:name="_Toc237210793"/>
       <w:r>
         <w:t>3.4.1 Planifier un entretien</w:t>
       </w:r>
@@ -8361,7 +8367,7 @@
       <w:pPr>
         <w:pStyle w:val="Titre3"/>
       </w:pPr>
-      <w:bookmarkStart w:id="37" w:name="_Toc237209541"/>
+      <w:bookmarkStart w:id="37" w:name="_Toc237210794"/>
       <w:r>
         <w:t>3.4.2 Décision finale de recrutement</w:t>
       </w:r>
@@ -8408,7 +8414,7 @@
       <w:pPr>
         <w:pStyle w:val="Titre2"/>
       </w:pPr>
-      <w:bookmarkStart w:id="38" w:name="_Toc237209542"/>
+      <w:bookmarkStart w:id="38" w:name="_Toc237210795"/>
       <w:r>
         <w:t>3.5 Diagramme d'états — Cycle de vie d'une candidature</w:t>
       </w:r>
@@ -8465,7 +8471,7 @@
       <w:pPr>
         <w:pStyle w:val="Titre2"/>
       </w:pPr>
-      <w:bookmarkStart w:id="39" w:name="_Toc237209543"/>
+      <w:bookmarkStart w:id="39" w:name="_Toc237210796"/>
       <w:r>
         <w:t>3.6 Conception de la base de données</w:t>
       </w:r>
@@ -8539,7 +8545,7 @@
       <w:pPr>
         <w:pStyle w:val="Titre2"/>
       </w:pPr>
-      <w:bookmarkStart w:id="40" w:name="_Toc237209544"/>
+      <w:bookmarkStart w:id="40" w:name="_Toc237210797"/>
       <w:r>
         <w:t>3.7 Diagramme de déploiement</w:t>
       </w:r>
@@ -8591,7 +8597,7 @@
       <w:pPr>
         <w:pStyle w:val="Titre2"/>
       </w:pPr>
-      <w:bookmarkStart w:id="41" w:name="_Toc237209545"/>
+      <w:bookmarkStart w:id="41" w:name="_Toc237210798"/>
       <w:r>
         <w:t>3.8 Diagramme de composants</w:t>
       </w:r>
@@ -8643,7 +8649,7 @@
       <w:pPr>
         <w:pStyle w:val="Titre2"/>
       </w:pPr>
-      <w:bookmarkStart w:id="42" w:name="_Toc237209546"/>
+      <w:bookmarkStart w:id="42" w:name="_Toc237210799"/>
       <w:r>
         <w:t>3.9 Conclusion</w:t>
       </w:r>
@@ -8666,7 +8672,7 @@
       <w:pPr>
         <w:pStyle w:val="Titre1"/>
       </w:pPr>
-      <w:bookmarkStart w:id="43" w:name="_Toc237209547"/>
+      <w:bookmarkStart w:id="43" w:name="_Toc237210800"/>
       <w:r>
         <w:t>Chapitre 4 : Réalisation</w:t>
       </w:r>
@@ -8681,7 +8687,7 @@
       <w:pPr>
         <w:pStyle w:val="Titre2"/>
       </w:pPr>
-      <w:bookmarkStart w:id="44" w:name="_Toc237209548"/>
+      <w:bookmarkStart w:id="44" w:name="_Toc237210801"/>
       <w:r>
         <w:t>4.1 Introduction</w:t>
       </w:r>
@@ -8696,7 +8702,7 @@
       <w:pPr>
         <w:pStyle w:val="Titre2"/>
       </w:pPr>
-      <w:bookmarkStart w:id="45" w:name="_Toc237209549"/>
+      <w:bookmarkStart w:id="45" w:name="_Toc237210802"/>
       <w:r>
         <w:t>4.2 Environnement de travail</w:t>
       </w:r>
@@ -8706,7 +8712,7 @@
       <w:pPr>
         <w:pStyle w:val="Titre3"/>
       </w:pPr>
-      <w:bookmarkStart w:id="46" w:name="_Toc237209550"/>
+      <w:bookmarkStart w:id="46" w:name="_Toc237210803"/>
       <w:r>
         <w:t>4.2.1 Environnement matériel</w:t>
       </w:r>
@@ -8721,7 +8727,7 @@
       <w:pPr>
         <w:pStyle w:val="Titre3"/>
       </w:pPr>
-      <w:bookmarkStart w:id="47" w:name="_Toc237209551"/>
+      <w:bookmarkStart w:id="47" w:name="_Toc237210804"/>
       <w:r>
         <w:t>4.2.2 Environnement logiciel</w:t>
       </w:r>
@@ -8844,7 +8850,7 @@
       <w:pPr>
         <w:pStyle w:val="Titre3"/>
       </w:pPr>
-      <w:bookmarkStart w:id="48" w:name="_Toc237209552"/>
+      <w:bookmarkStart w:id="48" w:name="_Toc237210805"/>
       <w:r>
         <w:t>4.2.3 Autres</w:t>
       </w:r>
@@ -8859,7 +8865,7 @@
       <w:pPr>
         <w:pStyle w:val="Titre3"/>
       </w:pPr>
-      <w:bookmarkStart w:id="49" w:name="_Toc237209553"/>
+      <w:bookmarkStart w:id="49" w:name="_Toc237210806"/>
       <w:r>
         <w:t>4.2.4 Sécurité applicative</w:t>
       </w:r>
@@ -8883,7 +8889,7 @@
       <w:pPr>
         <w:pStyle w:val="Titre2"/>
       </w:pPr>
-      <w:bookmarkStart w:id="50" w:name="_Toc237209554"/>
+      <w:bookmarkStart w:id="50" w:name="_Toc237210807"/>
       <w:r>
         <w:t>4.3 Interfaces graphiques de l'application</w:t>
       </w:r>
@@ -9305,7 +9311,7 @@
       <w:pPr>
         <w:pStyle w:val="Titre2"/>
       </w:pPr>
-      <w:bookmarkStart w:id="51" w:name="_Toc237209555"/>
+      <w:bookmarkStart w:id="51" w:name="_Toc237210808"/>
       <w:r>
         <w:t>4.4 Tests</w:t>
       </w:r>
@@ -9315,7 +9321,7 @@
       <w:pPr>
         <w:pStyle w:val="Titre3"/>
       </w:pPr>
-      <w:bookmarkStart w:id="52" w:name="_Toc237209556"/>
+      <w:bookmarkStart w:id="52" w:name="_Toc237210809"/>
       <w:r>
         <w:t>4.4.1 Tests unitaires (JUnit 5 / Mockito)</w:t>
       </w:r>
@@ -9562,7 +9568,7 @@
       <w:pPr>
         <w:pStyle w:val="Titre3"/>
       </w:pPr>
-      <w:bookmarkStart w:id="53" w:name="_Toc237209557"/>
+      <w:bookmarkStart w:id="53" w:name="_Toc237210810"/>
       <w:r>
         <w:t>4.4.2 Tests fonctionnels manuels</w:t>
       </w:r>
@@ -10475,7 +10481,7 @@
       <w:pPr>
         <w:pStyle w:val="Titre3"/>
       </w:pPr>
-      <w:bookmarkStart w:id="54" w:name="_Toc237209558"/>
+      <w:bookmarkStart w:id="54" w:name="_Toc237210811"/>
       <w:r>
         <w:t>4.4.3 Tests des API avec Postman et Swagger</w:t>
       </w:r>
@@ -10490,7 +10496,7 @@
       <w:pPr>
         <w:pStyle w:val="Titre3"/>
       </w:pPr>
-      <w:bookmarkStart w:id="55" w:name="_Toc237209559"/>
+      <w:bookmarkStart w:id="55" w:name="_Toc237210812"/>
       <w:r>
         <w:t>4.4.4 Vérification de bout en bout</w:t>
       </w:r>
@@ -10505,7 +10511,7 @@
       <w:pPr>
         <w:pStyle w:val="Titre2"/>
       </w:pPr>
-      <w:bookmarkStart w:id="56" w:name="_Toc237209560"/>
+      <w:bookmarkStart w:id="56" w:name="_Toc237210813"/>
       <w:r>
         <w:t>4.5 Difficultés rencontrées et solutions apportées</w:t>
       </w:r>
@@ -10526,7 +10532,7 @@
       <w:pPr>
         <w:pStyle w:val="Titre3"/>
       </w:pPr>
-      <w:bookmarkStart w:id="57" w:name="_Toc237209561"/>
+      <w:bookmarkStart w:id="57" w:name="_Toc237210814"/>
       <w:r>
         <w:t>4.5.1 Notification incomplète des managers</w:t>
       </w:r>
@@ -10544,7 +10550,7 @@
       <w:pPr>
         <w:pStyle w:val="Titre3"/>
       </w:pPr>
-      <w:bookmarkStart w:id="58" w:name="_Toc237209562"/>
+      <w:bookmarkStart w:id="58" w:name="_Toc237210815"/>
       <w:r>
         <w:t>4.5.2 Distinguer un rejet RH d'un rejet manager</w:t>
       </w:r>
@@ -10559,7 +10565,7 @@
       <w:pPr>
         <w:pStyle w:val="Titre3"/>
       </w:pPr>
-      <w:bookmarkStart w:id="59" w:name="_Toc237209563"/>
+      <w:bookmarkStart w:id="59" w:name="_Toc237210816"/>
       <w:r>
         <w:t>4.5.3 Cohérence des transitions de statut</w:t>
       </w:r>
@@ -10574,7 +10580,7 @@
       <w:pPr>
         <w:pStyle w:val="Titre3"/>
       </w:pPr>
-      <w:bookmarkStart w:id="60" w:name="_Toc237209564"/>
+      <w:bookmarkStart w:id="60" w:name="_Toc237210817"/>
       <w:r>
         <w:t>4.5.4 Filtrage incomplet des routes de lecture pour les managers</w:t>
       </w:r>
@@ -10589,7 +10595,7 @@
       <w:pPr>
         <w:pStyle w:val="Titre3"/>
       </w:pPr>
-      <w:bookmarkStart w:id="61" w:name="_Toc237209565"/>
+      <w:bookmarkStart w:id="61" w:name="_Toc237210818"/>
       <w:r>
         <w:t>4.5.5 Solliciter le manager au bon moment du processus</w:t>
       </w:r>
@@ -10607,7 +10613,7 @@
       <w:pPr>
         <w:pStyle w:val="Titre3"/>
       </w:pPr>
-      <w:bookmarkStart w:id="62" w:name="_Toc237209566"/>
+      <w:bookmarkStart w:id="62" w:name="_Toc237210819"/>
       <w:r>
         <w:t>4.5.6 Pertinence du matching Job idéal</w:t>
       </w:r>
@@ -10625,7 +10631,7 @@
       <w:pPr>
         <w:pStyle w:val="Titre3"/>
       </w:pPr>
-      <w:bookmarkStart w:id="63" w:name="_Toc237209567"/>
+      <w:bookmarkStart w:id="63" w:name="_Toc237210820"/>
       <w:r>
         <w:t>4.5.7 Traitement distinct des candidatures retirées</w:t>
       </w:r>
@@ -10643,7 +10649,7 @@
       <w:pPr>
         <w:pStyle w:val="Titre2"/>
       </w:pPr>
-      <w:bookmarkStart w:id="64" w:name="_Toc237209568"/>
+      <w:bookmarkStart w:id="64" w:name="_Toc237210821"/>
       <w:r>
         <w:t>4.6 Protection des données et éthique de l'IA</w:t>
       </w:r>
@@ -10673,7 +10679,7 @@
       <w:pPr>
         <w:pStyle w:val="Titre2"/>
       </w:pPr>
-      <w:bookmarkStart w:id="65" w:name="_Toc237209569"/>
+      <w:bookmarkStart w:id="65" w:name="_Toc237210822"/>
       <w:r>
         <w:t>4.7 Bilan des fonctionnalités réalisées</w:t>
       </w:r>
@@ -11198,7 +11204,7 @@
       <w:pPr>
         <w:pStyle w:val="Titre2"/>
       </w:pPr>
-      <w:bookmarkStart w:id="66" w:name="_Toc237209570"/>
+      <w:bookmarkStart w:id="66" w:name="_Toc237210823"/>
       <w:r>
         <w:t>4.8 Conclusion</w:t>
       </w:r>
@@ -11222,7 +11228,7 @@
         <w:pStyle w:val="Titre1"/>
         <w:jc w:val="center"/>
       </w:pPr>
-      <w:bookmarkStart w:id="67" w:name="_Toc237209571"/>
+      <w:bookmarkStart w:id="67" w:name="_Toc237210824"/>
       <w:r>
         <w:t>Conclusion Générale et Perspectives</w:t>
       </w:r>
@@ -11230,7 +11236,10 @@
     </w:p>
     <w:p>
       <w:r>
-        <w:t>Sept mois après mon arrivée chez Sopra HR Software Tunisie pour ce Projet de Fin d'Études, JOB4YOU est passé du besoin identifié en entretien avec mon encadrant à une plateforme réellement utilisable pour gérer le processus de recrutement interne de l'entreprise.</w:t>
+        <w:t xml:space="preserve">Sept mois après mon arrivée chez Sopra HR Software Tunisie pour ce Projet de Fin d'Études, </w:t>
+      </w:r>
+      <w:r>
+        <w:t>JOB4YOU est passé d’un besoin identifié au début du projet à une plateforme fonctionnelle permettant de gérer le processus de recrutement interne de l’entreprise.</w:t>
       </w:r>
     </w:p>
     <w:p>
@@ -11245,7 +11254,10 @@
     </w:p>
     <w:p>
       <w:r>
-        <w:t>Au-delà de l'aspect purement technique, cette expérience en alternance au sein d'un grand groupe international a été particulièrement formatrice sur le plan professionnel : travail en équipe, communication régulière avec l'encadrant entreprise, prise en compte de contraintes réelles de sécurité et de fiabilité, et nécessité de livrer une solution robuste et évolutive dans un contexte de production.</w:t>
+        <w:t xml:space="preserve">Au-delà de l'aspect purement technique, cette expérience en alternance au sein d'un grand groupe international a été particulièrement formatrice sur le plan professionnel : travail en équipe, communication régulière avec l'encadrant entreprise, prise en compte de contraintes réelles de sécurité et de fiabilité, et nécessité de </w:t>
+      </w:r>
+      <w:r>
+        <w:t>concevoir une solution robuste et évolutive dans un contexte professionnel réel.</w:t>
       </w:r>
     </w:p>
     <w:p>
@@ -11279,7 +11291,7 @@
       <w:pPr>
         <w:pStyle w:val="Titre1"/>
       </w:pPr>
-      <w:bookmarkStart w:id="68" w:name="_Toc237209572"/>
+      <w:bookmarkStart w:id="68" w:name="_Toc237210825"/>
       <w:r>
         <w:t>Bibliographie</w:t>
       </w:r>
@@ -11465,7 +11477,7 @@
       <w:pPr>
         <w:pStyle w:val="Titre1"/>
       </w:pPr>
-      <w:bookmarkStart w:id="69" w:name="_Toc237209573"/>
+      <w:bookmarkStart w:id="69" w:name="_Toc237210826"/>
       <w:r>
         <w:t>Glossaire</w:t>
       </w:r>
@@ -11658,21 +11670,14 @@
           <w:ilvl w:val="0"/>
           <w:numId w:val="23"/>
         </w:numPr>
-      </w:pPr>
-      <w:r>
-        <w:t>Webhook : mécanisme par lequel une application notifie automatiquement une autre via une requête HTTP déclenchée par un événement.</w:t>
-      </w:r>
-    </w:p>
-    <w:p/>
-    <w:p>
-      <w:pPr>
         <w:rPr>
           <w:rFonts w:ascii="Calibri Light" w:eastAsia="Times New Roman" w:hAnsi="Calibri Light"/>
           <w:b/>
-          <w:sz w:val="24"/>
-          <w:szCs w:val="24"/>
-        </w:rPr>
-      </w:pPr>
+        </w:rPr>
+      </w:pPr>
+      <w:r>
+        <w:t>Webhook : mécanisme par lequel une application notifie automatiquement une autre via une requête HTTP déclenchée par un événement.</w:t>
+      </w:r>
     </w:p>
     <w:sectPr>
       <w:pgSz w:w="11906" w:h="16838"/>

</xml_diff>

<commit_message>
docs: rapport PFE - citations bibliographiques + schema pipeline IA (46 pages)
- Bibliographie numerotee [1]-[14] et renvois [n] dans le corps
  (Spring Boot, Spring Security, Angular, PostgreSQL, JWT, Cohere, n8n, UML, RGPD, OWASP)
- Schema textuel du pipeline de scoring IA en section 3.5 (sans nouvelle figure)
- Pagination inchangee (46 pages, listes figures/tableaux toujours coherentes)

Co-Authored-By: Claude Sonnet 5 <noreply@anthropic.com>
</commit_message>
<xml_diff>
--- a/Rapport-PFE/Rapport_PFE_Bargaoui_Haythem.docx
+++ b/Rapport-PFE/Rapport_PFE_Bargaoui_Haythem.docx
@@ -805,7 +805,7 @@
         <w:pStyle w:val="Titre1"/>
         <w:jc w:val="center"/>
       </w:pPr>
-      <w:bookmarkStart w:id="0" w:name="_Toc237210757"/>
+      <w:bookmarkStart w:id="0" w:name="_Toc237211616"/>
       <w:r>
         <w:t>Table des matières</w:t>
       </w:r>
@@ -855,7 +855,7 @@
         <w:rPr>
           <w:noProof/>
         </w:rPr>
-        <w:instrText xml:space="preserve"> PAGEREF _Toc237210757 \h </w:instrText>
+        <w:instrText xml:space="preserve"> PAGEREF _Toc237211616 \h </w:instrText>
       </w:r>
       <w:r>
         <w:rPr>
@@ -916,7 +916,7 @@
         <w:rPr>
           <w:noProof/>
         </w:rPr>
-        <w:instrText xml:space="preserve"> PAGEREF _Toc237210758 \h </w:instrText>
+        <w:instrText xml:space="preserve"> PAGEREF _Toc237211617 \h </w:instrText>
       </w:r>
       <w:r>
         <w:rPr>
@@ -977,7 +977,7 @@
         <w:rPr>
           <w:noProof/>
         </w:rPr>
-        <w:instrText xml:space="preserve"> PAGEREF _Toc237210759 \h </w:instrText>
+        <w:instrText xml:space="preserve"> PAGEREF _Toc237211618 \h </w:instrText>
       </w:r>
       <w:r>
         <w:rPr>
@@ -1038,7 +1038,7 @@
         <w:rPr>
           <w:noProof/>
         </w:rPr>
-        <w:instrText xml:space="preserve"> PAGEREF _Toc237210760 \h </w:instrText>
+        <w:instrText xml:space="preserve"> PAGEREF _Toc237211619 \h </w:instrText>
       </w:r>
       <w:r>
         <w:rPr>
@@ -1099,7 +1099,7 @@
         <w:rPr>
           <w:noProof/>
         </w:rPr>
-        <w:instrText xml:space="preserve"> PAGEREF _Toc237210761 \h </w:instrText>
+        <w:instrText xml:space="preserve"> PAGEREF _Toc237211620 \h </w:instrText>
       </w:r>
       <w:r>
         <w:rPr>
@@ -1160,7 +1160,7 @@
         <w:rPr>
           <w:noProof/>
         </w:rPr>
-        <w:instrText xml:space="preserve"> PAGEREF _Toc237210762 \h </w:instrText>
+        <w:instrText xml:space="preserve"> PAGEREF _Toc237211621 \h </w:instrText>
       </w:r>
       <w:r>
         <w:rPr>
@@ -1221,7 +1221,7 @@
         <w:rPr>
           <w:noProof/>
         </w:rPr>
-        <w:instrText xml:space="preserve"> PAGEREF _Toc237210763 \h </w:instrText>
+        <w:instrText xml:space="preserve"> PAGEREF _Toc237211622 \h </w:instrText>
       </w:r>
       <w:r>
         <w:rPr>
@@ -1282,7 +1282,7 @@
         <w:rPr>
           <w:noProof/>
         </w:rPr>
-        <w:instrText xml:space="preserve"> PAGEREF _Toc237210764 \h </w:instrText>
+        <w:instrText xml:space="preserve"> PAGEREF _Toc237211623 \h </w:instrText>
       </w:r>
       <w:r>
         <w:rPr>
@@ -1343,7 +1343,7 @@
         <w:rPr>
           <w:noProof/>
         </w:rPr>
-        <w:instrText xml:space="preserve"> PAGEREF _Toc237210765 \h </w:instrText>
+        <w:instrText xml:space="preserve"> PAGEREF _Toc237211624 \h </w:instrText>
       </w:r>
       <w:r>
         <w:rPr>
@@ -1404,7 +1404,7 @@
         <w:rPr>
           <w:noProof/>
         </w:rPr>
-        <w:instrText xml:space="preserve"> PAGEREF _Toc237210766 \h </w:instrText>
+        <w:instrText xml:space="preserve"> PAGEREF _Toc237211625 \h </w:instrText>
       </w:r>
       <w:r>
         <w:rPr>
@@ -1465,7 +1465,7 @@
         <w:rPr>
           <w:noProof/>
         </w:rPr>
-        <w:instrText xml:space="preserve"> PAGEREF _Toc237210767 \h </w:instrText>
+        <w:instrText xml:space="preserve"> PAGEREF _Toc237211626 \h </w:instrText>
       </w:r>
       <w:r>
         <w:rPr>
@@ -1526,7 +1526,7 @@
         <w:rPr>
           <w:noProof/>
         </w:rPr>
-        <w:instrText xml:space="preserve"> PAGEREF _Toc237210768 \h </w:instrText>
+        <w:instrText xml:space="preserve"> PAGEREF _Toc237211627 \h </w:instrText>
       </w:r>
       <w:r>
         <w:rPr>
@@ -1587,7 +1587,7 @@
         <w:rPr>
           <w:noProof/>
         </w:rPr>
-        <w:instrText xml:space="preserve"> PAGEREF _Toc237210769 \h </w:instrText>
+        <w:instrText xml:space="preserve"> PAGEREF _Toc237211628 \h </w:instrText>
       </w:r>
       <w:r>
         <w:rPr>
@@ -1648,7 +1648,7 @@
         <w:rPr>
           <w:noProof/>
         </w:rPr>
-        <w:instrText xml:space="preserve"> PAGEREF _Toc237210770 \h </w:instrText>
+        <w:instrText xml:space="preserve"> PAGEREF _Toc237211629 \h </w:instrText>
       </w:r>
       <w:r>
         <w:rPr>
@@ -1709,7 +1709,7 @@
         <w:rPr>
           <w:noProof/>
         </w:rPr>
-        <w:instrText xml:space="preserve"> PAGEREF _Toc237210771 \h </w:instrText>
+        <w:instrText xml:space="preserve"> PAGEREF _Toc237211630 \h </w:instrText>
       </w:r>
       <w:r>
         <w:rPr>
@@ -1770,7 +1770,7 @@
         <w:rPr>
           <w:noProof/>
         </w:rPr>
-        <w:instrText xml:space="preserve"> PAGEREF _Toc237210772 \h </w:instrText>
+        <w:instrText xml:space="preserve"> PAGEREF _Toc237211631 \h </w:instrText>
       </w:r>
       <w:r>
         <w:rPr>
@@ -1831,7 +1831,7 @@
         <w:rPr>
           <w:noProof/>
         </w:rPr>
-        <w:instrText xml:space="preserve"> PAGEREF _Toc237210773 \h </w:instrText>
+        <w:instrText xml:space="preserve"> PAGEREF _Toc237211632 \h </w:instrText>
       </w:r>
       <w:r>
         <w:rPr>
@@ -1892,7 +1892,7 @@
         <w:rPr>
           <w:noProof/>
         </w:rPr>
-        <w:instrText xml:space="preserve"> PAGEREF _Toc237210774 \h </w:instrText>
+        <w:instrText xml:space="preserve"> PAGEREF _Toc237211633 \h </w:instrText>
       </w:r>
       <w:r>
         <w:rPr>
@@ -1953,7 +1953,7 @@
         <w:rPr>
           <w:noProof/>
         </w:rPr>
-        <w:instrText xml:space="preserve"> PAGEREF _Toc237210775 \h </w:instrText>
+        <w:instrText xml:space="preserve"> PAGEREF _Toc237211634 \h </w:instrText>
       </w:r>
       <w:r>
         <w:rPr>
@@ -2014,7 +2014,7 @@
         <w:rPr>
           <w:noProof/>
         </w:rPr>
-        <w:instrText xml:space="preserve"> PAGEREF _Toc237210776 \h </w:instrText>
+        <w:instrText xml:space="preserve"> PAGEREF _Toc237211635 \h </w:instrText>
       </w:r>
       <w:r>
         <w:rPr>
@@ -2075,7 +2075,7 @@
         <w:rPr>
           <w:noProof/>
         </w:rPr>
-        <w:instrText xml:space="preserve"> PAGEREF _Toc237210777 \h </w:instrText>
+        <w:instrText xml:space="preserve"> PAGEREF _Toc237211636 \h </w:instrText>
       </w:r>
       <w:r>
         <w:rPr>
@@ -2136,7 +2136,7 @@
         <w:rPr>
           <w:noProof/>
         </w:rPr>
-        <w:instrText xml:space="preserve"> PAGEREF _Toc237210778 \h </w:instrText>
+        <w:instrText xml:space="preserve"> PAGEREF _Toc237211637 \h </w:instrText>
       </w:r>
       <w:r>
         <w:rPr>
@@ -2197,7 +2197,7 @@
         <w:rPr>
           <w:noProof/>
         </w:rPr>
-        <w:instrText xml:space="preserve"> PAGEREF _Toc237210779 \h </w:instrText>
+        <w:instrText xml:space="preserve"> PAGEREF _Toc237211638 \h </w:instrText>
       </w:r>
       <w:r>
         <w:rPr>
@@ -2258,7 +2258,7 @@
         <w:rPr>
           <w:noProof/>
         </w:rPr>
-        <w:instrText xml:space="preserve"> PAGEREF _Toc237210780 \h </w:instrText>
+        <w:instrText xml:space="preserve"> PAGEREF _Toc237211639 \h </w:instrText>
       </w:r>
       <w:r>
         <w:rPr>
@@ -2319,7 +2319,7 @@
         <w:rPr>
           <w:noProof/>
         </w:rPr>
-        <w:instrText xml:space="preserve"> PAGEREF _Toc237210781 \h </w:instrText>
+        <w:instrText xml:space="preserve"> PAGEREF _Toc237211640 \h </w:instrText>
       </w:r>
       <w:r>
         <w:rPr>
@@ -2380,7 +2380,7 @@
         <w:rPr>
           <w:noProof/>
         </w:rPr>
-        <w:instrText xml:space="preserve"> PAGEREF _Toc237210782 \h </w:instrText>
+        <w:instrText xml:space="preserve"> PAGEREF _Toc237211641 \h </w:instrText>
       </w:r>
       <w:r>
         <w:rPr>
@@ -2441,7 +2441,7 @@
         <w:rPr>
           <w:noProof/>
         </w:rPr>
-        <w:instrText xml:space="preserve"> PAGEREF _Toc237210783 \h </w:instrText>
+        <w:instrText xml:space="preserve"> PAGEREF _Toc237211642 \h </w:instrText>
       </w:r>
       <w:r>
         <w:rPr>
@@ -2502,7 +2502,7 @@
         <w:rPr>
           <w:noProof/>
         </w:rPr>
-        <w:instrText xml:space="preserve"> PAGEREF _Toc237210784 \h </w:instrText>
+        <w:instrText xml:space="preserve"> PAGEREF _Toc237211643 \h </w:instrText>
       </w:r>
       <w:r>
         <w:rPr>
@@ -2563,7 +2563,7 @@
         <w:rPr>
           <w:noProof/>
         </w:rPr>
-        <w:instrText xml:space="preserve"> PAGEREF _Toc237210785 \h </w:instrText>
+        <w:instrText xml:space="preserve"> PAGEREF _Toc237211644 \h </w:instrText>
       </w:r>
       <w:r>
         <w:rPr>
@@ -2624,7 +2624,7 @@
         <w:rPr>
           <w:noProof/>
         </w:rPr>
-        <w:instrText xml:space="preserve"> PAGEREF _Toc237210786 \h </w:instrText>
+        <w:instrText xml:space="preserve"> PAGEREF _Toc237211645 \h </w:instrText>
       </w:r>
       <w:r>
         <w:rPr>
@@ -2685,7 +2685,7 @@
         <w:rPr>
           <w:noProof/>
         </w:rPr>
-        <w:instrText xml:space="preserve"> PAGEREF _Toc237210787 \h </w:instrText>
+        <w:instrText xml:space="preserve"> PAGEREF _Toc237211646 \h </w:instrText>
       </w:r>
       <w:r>
         <w:rPr>
@@ -2746,7 +2746,7 @@
         <w:rPr>
           <w:noProof/>
         </w:rPr>
-        <w:instrText xml:space="preserve"> PAGEREF _Toc237210788 \h </w:instrText>
+        <w:instrText xml:space="preserve"> PAGEREF _Toc237211647 \h </w:instrText>
       </w:r>
       <w:r>
         <w:rPr>
@@ -2807,7 +2807,7 @@
         <w:rPr>
           <w:noProof/>
         </w:rPr>
-        <w:instrText xml:space="preserve"> PAGEREF _Toc237210789 \h </w:instrText>
+        <w:instrText xml:space="preserve"> PAGEREF _Toc237211648 \h </w:instrText>
       </w:r>
       <w:r>
         <w:rPr>
@@ -2868,7 +2868,7 @@
         <w:rPr>
           <w:noProof/>
         </w:rPr>
-        <w:instrText xml:space="preserve"> PAGEREF _Toc237210790 \h </w:instrText>
+        <w:instrText xml:space="preserve"> PAGEREF _Toc237211649 \h </w:instrText>
       </w:r>
       <w:r>
         <w:rPr>
@@ -2929,7 +2929,7 @@
         <w:rPr>
           <w:noProof/>
         </w:rPr>
-        <w:instrText xml:space="preserve"> PAGEREF _Toc237210791 \h </w:instrText>
+        <w:instrText xml:space="preserve"> PAGEREF _Toc237211650 \h </w:instrText>
       </w:r>
       <w:r>
         <w:rPr>
@@ -2990,7 +2990,7 @@
         <w:rPr>
           <w:noProof/>
         </w:rPr>
-        <w:instrText xml:space="preserve"> PAGEREF _Toc237210792 \h </w:instrText>
+        <w:instrText xml:space="preserve"> PAGEREF _Toc237211651 \h </w:instrText>
       </w:r>
       <w:r>
         <w:rPr>
@@ -3051,7 +3051,7 @@
         <w:rPr>
           <w:noProof/>
         </w:rPr>
-        <w:instrText xml:space="preserve"> PAGEREF _Toc237210793 \h </w:instrText>
+        <w:instrText xml:space="preserve"> PAGEREF _Toc237211652 \h </w:instrText>
       </w:r>
       <w:r>
         <w:rPr>
@@ -3112,7 +3112,7 @@
         <w:rPr>
           <w:noProof/>
         </w:rPr>
-        <w:instrText xml:space="preserve"> PAGEREF _Toc237210794 \h </w:instrText>
+        <w:instrText xml:space="preserve"> PAGEREF _Toc237211653 \h </w:instrText>
       </w:r>
       <w:r>
         <w:rPr>
@@ -3173,7 +3173,7 @@
         <w:rPr>
           <w:noProof/>
         </w:rPr>
-        <w:instrText xml:space="preserve"> PAGEREF _Toc237210795 \h </w:instrText>
+        <w:instrText xml:space="preserve"> PAGEREF _Toc237211654 \h </w:instrText>
       </w:r>
       <w:r>
         <w:rPr>
@@ -3234,7 +3234,7 @@
         <w:rPr>
           <w:noProof/>
         </w:rPr>
-        <w:instrText xml:space="preserve"> PAGEREF _Toc237210796 \h </w:instrText>
+        <w:instrText xml:space="preserve"> PAGEREF _Toc237211655 \h </w:instrText>
       </w:r>
       <w:r>
         <w:rPr>
@@ -3295,7 +3295,7 @@
         <w:rPr>
           <w:noProof/>
         </w:rPr>
-        <w:instrText xml:space="preserve"> PAGEREF _Toc237210797 \h </w:instrText>
+        <w:instrText xml:space="preserve"> PAGEREF _Toc237211656 \h </w:instrText>
       </w:r>
       <w:r>
         <w:rPr>
@@ -3356,7 +3356,7 @@
         <w:rPr>
           <w:noProof/>
         </w:rPr>
-        <w:instrText xml:space="preserve"> PAGEREF _Toc237210798 \h </w:instrText>
+        <w:instrText xml:space="preserve"> PAGEREF _Toc237211657 \h </w:instrText>
       </w:r>
       <w:r>
         <w:rPr>
@@ -3417,7 +3417,7 @@
         <w:rPr>
           <w:noProof/>
         </w:rPr>
-        <w:instrText xml:space="preserve"> PAGEREF _Toc237210799 \h </w:instrText>
+        <w:instrText xml:space="preserve"> PAGEREF _Toc237211658 \h </w:instrText>
       </w:r>
       <w:r>
         <w:rPr>
@@ -3478,7 +3478,7 @@
         <w:rPr>
           <w:noProof/>
         </w:rPr>
-        <w:instrText xml:space="preserve"> PAGEREF _Toc237210800 \h </w:instrText>
+        <w:instrText xml:space="preserve"> PAGEREF _Toc237211659 \h </w:instrText>
       </w:r>
       <w:r>
         <w:rPr>
@@ -3539,7 +3539,7 @@
         <w:rPr>
           <w:noProof/>
         </w:rPr>
-        <w:instrText xml:space="preserve"> PAGEREF _Toc237210801 \h </w:instrText>
+        <w:instrText xml:space="preserve"> PAGEREF _Toc237211660 \h </w:instrText>
       </w:r>
       <w:r>
         <w:rPr>
@@ -3600,7 +3600,7 @@
         <w:rPr>
           <w:noProof/>
         </w:rPr>
-        <w:instrText xml:space="preserve"> PAGEREF _Toc237210802 \h </w:instrText>
+        <w:instrText xml:space="preserve"> PAGEREF _Toc237211661 \h </w:instrText>
       </w:r>
       <w:r>
         <w:rPr>
@@ -3661,7 +3661,7 @@
         <w:rPr>
           <w:noProof/>
         </w:rPr>
-        <w:instrText xml:space="preserve"> PAGEREF _Toc237210803 \h </w:instrText>
+        <w:instrText xml:space="preserve"> PAGEREF _Toc237211662 \h </w:instrText>
       </w:r>
       <w:r>
         <w:rPr>
@@ -3722,7 +3722,7 @@
         <w:rPr>
           <w:noProof/>
         </w:rPr>
-        <w:instrText xml:space="preserve"> PAGEREF _Toc237210804 \h </w:instrText>
+        <w:instrText xml:space="preserve"> PAGEREF _Toc237211663 \h </w:instrText>
       </w:r>
       <w:r>
         <w:rPr>
@@ -3783,7 +3783,7 @@
         <w:rPr>
           <w:noProof/>
         </w:rPr>
-        <w:instrText xml:space="preserve"> PAGEREF _Toc237210805 \h </w:instrText>
+        <w:instrText xml:space="preserve"> PAGEREF _Toc237211664 \h </w:instrText>
       </w:r>
       <w:r>
         <w:rPr>
@@ -3844,7 +3844,7 @@
         <w:rPr>
           <w:noProof/>
         </w:rPr>
-        <w:instrText xml:space="preserve"> PAGEREF _Toc237210806 \h </w:instrText>
+        <w:instrText xml:space="preserve"> PAGEREF _Toc237211665 \h </w:instrText>
       </w:r>
       <w:r>
         <w:rPr>
@@ -3905,7 +3905,7 @@
         <w:rPr>
           <w:noProof/>
         </w:rPr>
-        <w:instrText xml:space="preserve"> PAGEREF _Toc237210807 \h </w:instrText>
+        <w:instrText xml:space="preserve"> PAGEREF _Toc237211666 \h </w:instrText>
       </w:r>
       <w:r>
         <w:rPr>
@@ -3966,7 +3966,7 @@
         <w:rPr>
           <w:noProof/>
         </w:rPr>
-        <w:instrText xml:space="preserve"> PAGEREF _Toc237210808 \h </w:instrText>
+        <w:instrText xml:space="preserve"> PAGEREF _Toc237211667 \h </w:instrText>
       </w:r>
       <w:r>
         <w:rPr>
@@ -4027,7 +4027,7 @@
         <w:rPr>
           <w:noProof/>
         </w:rPr>
-        <w:instrText xml:space="preserve"> PAGEREF _Toc237210809 \h </w:instrText>
+        <w:instrText xml:space="preserve"> PAGEREF _Toc237211668 \h </w:instrText>
       </w:r>
       <w:r>
         <w:rPr>
@@ -4088,7 +4088,7 @@
         <w:rPr>
           <w:noProof/>
         </w:rPr>
-        <w:instrText xml:space="preserve"> PAGEREF _Toc237210810 \h </w:instrText>
+        <w:instrText xml:space="preserve"> PAGEREF _Toc237211669 \h </w:instrText>
       </w:r>
       <w:r>
         <w:rPr>
@@ -4149,7 +4149,7 @@
         <w:rPr>
           <w:noProof/>
         </w:rPr>
-        <w:instrText xml:space="preserve"> PAGEREF _Toc237210811 \h </w:instrText>
+        <w:instrText xml:space="preserve"> PAGEREF _Toc237211670 \h </w:instrText>
       </w:r>
       <w:r>
         <w:rPr>
@@ -4210,7 +4210,7 @@
         <w:rPr>
           <w:noProof/>
         </w:rPr>
-        <w:instrText xml:space="preserve"> PAGEREF _Toc237210812 \h </w:instrText>
+        <w:instrText xml:space="preserve"> PAGEREF _Toc237211671 \h </w:instrText>
       </w:r>
       <w:r>
         <w:rPr>
@@ -4271,7 +4271,7 @@
         <w:rPr>
           <w:noProof/>
         </w:rPr>
-        <w:instrText xml:space="preserve"> PAGEREF _Toc237210813 \h </w:instrText>
+        <w:instrText xml:space="preserve"> PAGEREF _Toc237211672 \h </w:instrText>
       </w:r>
       <w:r>
         <w:rPr>
@@ -4332,7 +4332,7 @@
         <w:rPr>
           <w:noProof/>
         </w:rPr>
-        <w:instrText xml:space="preserve"> PAGEREF _Toc237210814 \h </w:instrText>
+        <w:instrText xml:space="preserve"> PAGEREF _Toc237211673 \h </w:instrText>
       </w:r>
       <w:r>
         <w:rPr>
@@ -4393,7 +4393,7 @@
         <w:rPr>
           <w:noProof/>
         </w:rPr>
-        <w:instrText xml:space="preserve"> PAGEREF _Toc237210815 \h </w:instrText>
+        <w:instrText xml:space="preserve"> PAGEREF _Toc237211674 \h </w:instrText>
       </w:r>
       <w:r>
         <w:rPr>
@@ -4454,7 +4454,7 @@
         <w:rPr>
           <w:noProof/>
         </w:rPr>
-        <w:instrText xml:space="preserve"> PAGEREF _Toc237210816 \h </w:instrText>
+        <w:instrText xml:space="preserve"> PAGEREF _Toc237211675 \h </w:instrText>
       </w:r>
       <w:r>
         <w:rPr>
@@ -4515,7 +4515,7 @@
         <w:rPr>
           <w:noProof/>
         </w:rPr>
-        <w:instrText xml:space="preserve"> PAGEREF _Toc237210817 \h </w:instrText>
+        <w:instrText xml:space="preserve"> PAGEREF _Toc237211676 \h </w:instrText>
       </w:r>
       <w:r>
         <w:rPr>
@@ -4576,7 +4576,7 @@
         <w:rPr>
           <w:noProof/>
         </w:rPr>
-        <w:instrText xml:space="preserve"> PAGEREF _Toc237210818 \h </w:instrText>
+        <w:instrText xml:space="preserve"> PAGEREF _Toc237211677 \h </w:instrText>
       </w:r>
       <w:r>
         <w:rPr>
@@ -4637,7 +4637,7 @@
         <w:rPr>
           <w:noProof/>
         </w:rPr>
-        <w:instrText xml:space="preserve"> PAGEREF _Toc237210819 \h </w:instrText>
+        <w:instrText xml:space="preserve"> PAGEREF _Toc237211678 \h </w:instrText>
       </w:r>
       <w:r>
         <w:rPr>
@@ -4698,7 +4698,7 @@
         <w:rPr>
           <w:noProof/>
         </w:rPr>
-        <w:instrText xml:space="preserve"> PAGEREF _Toc237210820 \h </w:instrText>
+        <w:instrText xml:space="preserve"> PAGEREF _Toc237211679 \h </w:instrText>
       </w:r>
       <w:r>
         <w:rPr>
@@ -4759,7 +4759,7 @@
         <w:rPr>
           <w:noProof/>
         </w:rPr>
-        <w:instrText xml:space="preserve"> PAGEREF _Toc237210821 \h </w:instrText>
+        <w:instrText xml:space="preserve"> PAGEREF _Toc237211680 \h </w:instrText>
       </w:r>
       <w:r>
         <w:rPr>
@@ -4820,7 +4820,7 @@
         <w:rPr>
           <w:noProof/>
         </w:rPr>
-        <w:instrText xml:space="preserve"> PAGEREF _Toc237210822 \h </w:instrText>
+        <w:instrText xml:space="preserve"> PAGEREF _Toc237211681 \h </w:instrText>
       </w:r>
       <w:r>
         <w:rPr>
@@ -4881,7 +4881,7 @@
         <w:rPr>
           <w:noProof/>
         </w:rPr>
-        <w:instrText xml:space="preserve"> PAGEREF _Toc237210823 \h </w:instrText>
+        <w:instrText xml:space="preserve"> PAGEREF _Toc237211682 \h </w:instrText>
       </w:r>
       <w:r>
         <w:rPr>
@@ -4942,7 +4942,7 @@
         <w:rPr>
           <w:noProof/>
         </w:rPr>
-        <w:instrText xml:space="preserve"> PAGEREF _Toc237210824 \h </w:instrText>
+        <w:instrText xml:space="preserve"> PAGEREF _Toc237211683 \h </w:instrText>
       </w:r>
       <w:r>
         <w:rPr>
@@ -5003,7 +5003,7 @@
         <w:rPr>
           <w:noProof/>
         </w:rPr>
-        <w:instrText xml:space="preserve"> PAGEREF _Toc237210825 \h </w:instrText>
+        <w:instrText xml:space="preserve"> PAGEREF _Toc237211684 \h </w:instrText>
       </w:r>
       <w:r>
         <w:rPr>
@@ -5064,7 +5064,7 @@
         <w:rPr>
           <w:noProof/>
         </w:rPr>
-        <w:instrText xml:space="preserve"> PAGEREF _Toc237210826 \h </w:instrText>
+        <w:instrText xml:space="preserve"> PAGEREF _Toc237211685 \h </w:instrText>
       </w:r>
       <w:r>
         <w:rPr>
@@ -5107,7 +5107,7 @@
       <w:pPr>
         <w:pStyle w:val="Titre1"/>
       </w:pPr>
-      <w:bookmarkStart w:id="1" w:name="_Toc237210758"/>
+      <w:bookmarkStart w:id="1" w:name="_Toc237211617"/>
       <w:r>
         <w:t>Liste des figures</w:t>
       </w:r>
@@ -5436,7 +5436,7 @@
       <w:pPr>
         <w:pStyle w:val="Titre1"/>
       </w:pPr>
-      <w:bookmarkStart w:id="2" w:name="_Toc237210759"/>
+      <w:bookmarkStart w:id="2" w:name="_Toc237211618"/>
       <w:r>
         <w:t>Liste des tableaux</w:t>
       </w:r>
@@ -5500,7 +5500,7 @@
         <w:pStyle w:val="Titre1"/>
         <w:jc w:val="center"/>
       </w:pPr>
-      <w:bookmarkStart w:id="3" w:name="_Toc237210760"/>
+      <w:bookmarkStart w:id="3" w:name="_Toc237211619"/>
       <w:r>
         <w:t>Introduction Générale</w:t>
       </w:r>
@@ -5533,7 +5533,7 @@
       <w:pPr>
         <w:pStyle w:val="Titre1"/>
       </w:pPr>
-      <w:bookmarkStart w:id="4" w:name="_Toc237210761"/>
+      <w:bookmarkStart w:id="4" w:name="_Toc237211620"/>
       <w:r>
         <w:t>Chapitre 1 : Cadre Général du Projet</w:t>
       </w:r>
@@ -5548,7 +5548,7 @@
       <w:pPr>
         <w:pStyle w:val="Titre2"/>
       </w:pPr>
-      <w:bookmarkStart w:id="5" w:name="_Toc237210762"/>
+      <w:bookmarkStart w:id="5" w:name="_Toc237211621"/>
       <w:r>
         <w:t>1.1 Introduction</w:t>
       </w:r>
@@ -5563,7 +5563,7 @@
       <w:pPr>
         <w:pStyle w:val="Titre2"/>
       </w:pPr>
-      <w:bookmarkStart w:id="6" w:name="_Toc237210763"/>
+      <w:bookmarkStart w:id="6" w:name="_Toc237211622"/>
       <w:r>
         <w:t>1.2 Présentation de l'organisme d'accueil</w:t>
       </w:r>
@@ -5573,7 +5573,7 @@
       <w:pPr>
         <w:pStyle w:val="Titre3"/>
       </w:pPr>
-      <w:bookmarkStart w:id="7" w:name="_Toc237210764"/>
+      <w:bookmarkStart w:id="7" w:name="_Toc237211623"/>
       <w:r>
         <w:t>1.2.1 Le groupe Sopra Steria</w:t>
       </w:r>
@@ -5588,7 +5588,7 @@
       <w:pPr>
         <w:pStyle w:val="Titre3"/>
       </w:pPr>
-      <w:bookmarkStart w:id="8" w:name="_Toc237210765"/>
+      <w:bookmarkStart w:id="8" w:name="_Toc237211624"/>
       <w:r>
         <w:t>1.2.2 Sopra HR Software</w:t>
       </w:r>
@@ -5608,7 +5608,7 @@
       <w:pPr>
         <w:pStyle w:val="Titre2"/>
       </w:pPr>
-      <w:bookmarkStart w:id="9" w:name="_Toc237210766"/>
+      <w:bookmarkStart w:id="9" w:name="_Toc237211625"/>
       <w:r>
         <w:t>1.3 Étude de l'existant</w:t>
       </w:r>
@@ -5695,7 +5695,7 @@
       <w:pPr>
         <w:pStyle w:val="Titre2"/>
       </w:pPr>
-      <w:bookmarkStart w:id="10" w:name="_Toc237210767"/>
+      <w:bookmarkStart w:id="10" w:name="_Toc237211626"/>
       <w:r>
         <w:t>1.4 Critique de l'existant et problématique</w:t>
       </w:r>
@@ -5715,7 +5715,7 @@
       <w:pPr>
         <w:pStyle w:val="Titre2"/>
       </w:pPr>
-      <w:bookmarkStart w:id="11" w:name="_Toc237210768"/>
+      <w:bookmarkStart w:id="11" w:name="_Toc237211627"/>
       <w:r>
         <w:t>1.5 Objectifs du projet</w:t>
       </w:r>
@@ -5802,7 +5802,7 @@
       <w:pPr>
         <w:pStyle w:val="Titre2"/>
       </w:pPr>
-      <w:bookmarkStart w:id="12" w:name="_Toc237210769"/>
+      <w:bookmarkStart w:id="12" w:name="_Toc237211628"/>
       <w:r>
         <w:t>1.6 Présentation de la solution proposée : JOB4YOU</w:t>
       </w:r>
@@ -5870,7 +5870,7 @@
       <w:pPr>
         <w:pStyle w:val="Titre2"/>
       </w:pPr>
-      <w:bookmarkStart w:id="13" w:name="_Toc237210770"/>
+      <w:bookmarkStart w:id="13" w:name="_Toc237211629"/>
       <w:r>
         <w:t>1.7 Méthodologie de travail adoptée</w:t>
       </w:r>
@@ -5890,7 +5890,7 @@
       <w:pPr>
         <w:pStyle w:val="Titre2"/>
       </w:pPr>
-      <w:bookmarkStart w:id="14" w:name="_Toc237210771"/>
+      <w:bookmarkStart w:id="14" w:name="_Toc237211630"/>
       <w:r>
         <w:t>1.8 Planification du projet</w:t>
       </w:r>
@@ -6098,7 +6098,19 @@
               <w:rPr>
                 <w:sz w:val="21"/>
               </w:rPr>
-              <w:t>Spécification des besoins, modélisation UML (cas d'utilisation, séquence, classes), conception de la base de données</w:t>
+              <w:t xml:space="preserve">Spécification des besoins, </w:t>
+            </w:r>
+            <w:r>
+              <w:rPr>
+                <w:sz w:val="21"/>
+              </w:rPr>
+              <w:t>modélisation UML [8] (cas d’utilisation</w:t>
+            </w:r>
+            <w:r>
+              <w:rPr>
+                <w:sz w:val="21"/>
+              </w:rPr>
+              <w:t>, séquence, classes), conception de la base de données</w:t>
             </w:r>
           </w:p>
         </w:tc>
@@ -6278,7 +6290,7 @@
       <w:pPr>
         <w:pStyle w:val="Titre2"/>
       </w:pPr>
-      <w:bookmarkStart w:id="15" w:name="_Toc237210772"/>
+      <w:bookmarkStart w:id="15" w:name="_Toc237211631"/>
       <w:r>
         <w:t>1.9 Conclusion</w:t>
       </w:r>
@@ -6301,7 +6313,7 @@
       <w:pPr>
         <w:pStyle w:val="Titre1"/>
       </w:pPr>
-      <w:bookmarkStart w:id="16" w:name="_Toc237210773"/>
+      <w:bookmarkStart w:id="16" w:name="_Toc237211632"/>
       <w:r>
         <w:t>Chapitre 2 : Analyse et Spécification des Besoins</w:t>
       </w:r>
@@ -6316,7 +6328,7 @@
       <w:pPr>
         <w:pStyle w:val="Titre2"/>
       </w:pPr>
-      <w:bookmarkStart w:id="17" w:name="_Toc237210774"/>
+      <w:bookmarkStart w:id="17" w:name="_Toc237211633"/>
       <w:r>
         <w:t>2.1 Introduction</w:t>
       </w:r>
@@ -6331,7 +6343,7 @@
       <w:pPr>
         <w:pStyle w:val="Titre2"/>
       </w:pPr>
-      <w:bookmarkStart w:id="18" w:name="_Toc237210775"/>
+      <w:bookmarkStart w:id="18" w:name="_Toc237211634"/>
       <w:r>
         <w:t>2.2 Étude fonctionnelle</w:t>
       </w:r>
@@ -6341,7 +6353,7 @@
       <w:pPr>
         <w:pStyle w:val="Titre3"/>
       </w:pPr>
-      <w:bookmarkStart w:id="19" w:name="_Toc237210776"/>
+      <w:bookmarkStart w:id="19" w:name="_Toc237211635"/>
       <w:r>
         <w:t>2.2.1 Identification des acteurs du système</w:t>
       </w:r>
@@ -7302,7 +7314,7 @@
       <w:pPr>
         <w:pStyle w:val="Titre3"/>
       </w:pPr>
-      <w:bookmarkStart w:id="20" w:name="_Toc237210777"/>
+      <w:bookmarkStart w:id="20" w:name="_Toc237211636"/>
       <w:r>
         <w:t>2.2.2 Identification des besoins fonctionnels</w:t>
       </w:r>
@@ -7449,7 +7461,7 @@
       <w:pPr>
         <w:pStyle w:val="Titre3"/>
       </w:pPr>
-      <w:bookmarkStart w:id="21" w:name="_Toc237210778"/>
+      <w:bookmarkStart w:id="21" w:name="_Toc237211637"/>
       <w:r>
         <w:t>2.2.3 Identification des besoins non fonctionnels</w:t>
       </w:r>
@@ -7536,7 +7548,7 @@
       <w:pPr>
         <w:pStyle w:val="Titre3"/>
       </w:pPr>
-      <w:bookmarkStart w:id="22" w:name="_Toc237210779"/>
+      <w:bookmarkStart w:id="22" w:name="_Toc237211638"/>
       <w:r>
         <w:t>2.2.4 Diagramme de cas d'utilisation</w:t>
       </w:r>
@@ -7585,7 +7597,7 @@
       <w:pPr>
         <w:pStyle w:val="Titre3"/>
       </w:pPr>
-      <w:bookmarkStart w:id="23" w:name="_Toc237210780"/>
+      <w:bookmarkStart w:id="23" w:name="_Toc237211639"/>
       <w:r>
         <w:t>2.2.5 Description textuelle de quelques cas d'utilisation</w:t>
       </w:r>
@@ -7972,7 +7984,7 @@
       <w:pPr>
         <w:pStyle w:val="Titre3"/>
       </w:pPr>
-      <w:bookmarkStart w:id="24" w:name="_Toc237210781"/>
+      <w:bookmarkStart w:id="24" w:name="_Toc237211640"/>
       <w:r>
         <w:t>2.2.6 Diagramme de séquence système</w:t>
       </w:r>
@@ -8019,7 +8031,7 @@
       <w:pPr>
         <w:pStyle w:val="Titre2"/>
       </w:pPr>
-      <w:bookmarkStart w:id="25" w:name="_Toc237210782"/>
+      <w:bookmarkStart w:id="25" w:name="_Toc237211641"/>
       <w:r>
         <w:t>2.3 Étude technique</w:t>
       </w:r>
@@ -8029,7 +8041,7 @@
       <w:pPr>
         <w:pStyle w:val="Titre3"/>
       </w:pPr>
-      <w:bookmarkStart w:id="26" w:name="_Toc237210783"/>
+      <w:bookmarkStart w:id="26" w:name="_Toc237211642"/>
       <w:r>
         <w:t>2.3.1 Architecture physique</w:t>
       </w:r>
@@ -8037,7 +8049,31 @@
     </w:p>
     <w:p>
       <w:r>
-        <w:t>La plateforme repose sur une architecture distribuée en couches, illustrée par la figure suivante : un frontend Angular consommé par le navigateur, un backend Spring Boot exposant des API REST sécurisées, une base de données PostgreSQL, ainsi qu'un serveur n8n responsable de l'automatisation (scoring IA via l'API Cohere, notifications, intégration Google Calendar).</w:t>
+        <w:t xml:space="preserve">La plateforme repose sur une architecture distribuée en couches, illustrée par la figure suivante : </w:t>
+      </w:r>
+      <w:r>
+        <w:t>un frontend Angular [3] consommé par le navigateur</w:t>
+      </w:r>
+      <w:r>
+        <w:t xml:space="preserve">, </w:t>
+      </w:r>
+      <w:r>
+        <w:t>un backend Spring Boot [1] exposant des API REST sécurisées, une base de données PostgreSQL [4]</w:t>
+      </w:r>
+      <w:r>
+        <w:t>, ainsi qu'</w:t>
+      </w:r>
+      <w:r>
+        <w:t>un serveur n8n [7] responsable de l’automatisation</w:t>
+      </w:r>
+      <w:r>
+        <w:t xml:space="preserve"> (</w:t>
+      </w:r>
+      <w:r>
+        <w:t>scoring IA via l’API Cohere [6]</w:t>
+      </w:r>
+      <w:r>
+        <w:t>, notifications, intégration Google Calendar).</w:t>
       </w:r>
     </w:p>
     <w:p>
@@ -8076,7 +8112,7 @@
       <w:pPr>
         <w:pStyle w:val="Titre3"/>
       </w:pPr>
-      <w:bookmarkStart w:id="27" w:name="_Toc237210784"/>
+      <w:bookmarkStart w:id="27" w:name="_Toc237211643"/>
       <w:r>
         <w:t>2.3.2 Côté client — Angular</w:t>
       </w:r>
@@ -8091,7 +8127,7 @@
       <w:pPr>
         <w:pStyle w:val="Titre3"/>
       </w:pPr>
-      <w:bookmarkStart w:id="28" w:name="_Toc237210785"/>
+      <w:bookmarkStart w:id="28" w:name="_Toc237211644"/>
       <w:r>
         <w:t>2.3.3 Côté serveur — Spring Boot</w:t>
       </w:r>
@@ -8106,7 +8142,7 @@
       <w:pPr>
         <w:pStyle w:val="Titre3"/>
       </w:pPr>
-      <w:bookmarkStart w:id="29" w:name="_Toc237210786"/>
+      <w:bookmarkStart w:id="29" w:name="_Toc237211645"/>
       <w:r>
         <w:t>2.3.4 La sécurité — Spring Security et JWT</w:t>
       </w:r>
@@ -8114,14 +8150,20 @@
     </w:p>
     <w:p>
       <w:r>
-        <w:t>L'accès à la plateforme est sécurisé par Spring Security couplé à un mécanisme d'authentification par jeton JWT (JSON Web Token). Lors de la connexion, le serveur génère un jeton signé contenant l'identité et les rôles de l'utilisateur ; ce jeton est ensuite transmis dans l'en-tête de chaque requête pour authentifier l'utilisateur sans état de session côté serveur. Le contrôle d'accès est appliqué au niveau de chaque point d'entrée de l'API via l'annotation @PreAuthorize, garantissant que seuls les rôles autorisés (Administrateur, RH, Manager) peuvent accéder à une ressource donnée.</w:t>
+        <w:t xml:space="preserve">L'accès à la plateforme est </w:t>
+      </w:r>
+      <w:r>
+        <w:t>sécurisé par Spring Security [2]</w:t>
+      </w:r>
+      <w:r>
+        <w:t xml:space="preserve"> couplé à un mécanisme d'authentification par jeton JWT (JSON Web Token). Lors de la connexion, le serveur génère un jeton signé contenant l'identité et les rôles de l'utilisateur ; ce jeton est ensuite transmis dans l'en-tête de chaque requête pour authentifier l'utilisateur sans état de session côté serveur. Le contrôle d'accès est appliqué au niveau de chaque point d'entrée de l'API via l'annotation @PreAuthorize, garantissant que seuls les rôles autorisés (Administrateur, RH, Manager) peuvent accéder à une ressource donnée.</w:t>
       </w:r>
     </w:p>
     <w:p>
       <w:pPr>
         <w:pStyle w:val="Titre2"/>
       </w:pPr>
-      <w:bookmarkStart w:id="30" w:name="_Toc237210787"/>
+      <w:bookmarkStart w:id="30" w:name="_Toc237211646"/>
       <w:r>
         <w:t>2.4 Conclusion</w:t>
       </w:r>
@@ -8144,7 +8186,7 @@
       <w:pPr>
         <w:pStyle w:val="Titre1"/>
       </w:pPr>
-      <w:bookmarkStart w:id="31" w:name="_Toc237210788"/>
+      <w:bookmarkStart w:id="31" w:name="_Toc237211647"/>
       <w:r>
         <w:t>Chapitre 3 : Conception</w:t>
       </w:r>
@@ -8159,7 +8201,7 @@
       <w:pPr>
         <w:pStyle w:val="Titre2"/>
       </w:pPr>
-      <w:bookmarkStart w:id="32" w:name="_Toc237210789"/>
+      <w:bookmarkStart w:id="32" w:name="_Toc237211648"/>
       <w:r>
         <w:t>3.1 Introduction</w:t>
       </w:r>
@@ -8174,7 +8216,7 @@
       <w:pPr>
         <w:pStyle w:val="Titre2"/>
       </w:pPr>
-      <w:bookmarkStart w:id="33" w:name="_Toc237210790"/>
+      <w:bookmarkStart w:id="33" w:name="_Toc237211649"/>
       <w:r>
         <w:t>3.2 Diagramme des paquetages</w:t>
       </w:r>
@@ -8226,7 +8268,7 @@
       <w:pPr>
         <w:pStyle w:val="Titre2"/>
       </w:pPr>
-      <w:bookmarkStart w:id="34" w:name="_Toc237210791"/>
+      <w:bookmarkStart w:id="34" w:name="_Toc237211650"/>
       <w:r>
         <w:t>3.3 Diagramme de classes global</w:t>
       </w:r>
@@ -8305,7 +8347,7 @@
       <w:pPr>
         <w:pStyle w:val="Titre2"/>
       </w:pPr>
-      <w:bookmarkStart w:id="35" w:name="_Toc237210792"/>
+      <w:bookmarkStart w:id="35" w:name="_Toc237211651"/>
       <w:r>
         <w:t>3.4 Diagrammes de séquence objet</w:t>
       </w:r>
@@ -8320,7 +8362,7 @@
       <w:pPr>
         <w:pStyle w:val="Titre3"/>
       </w:pPr>
-      <w:bookmarkStart w:id="36" w:name="_Toc237210793"/>
+      <w:bookmarkStart w:id="36" w:name="_Toc237211652"/>
       <w:r>
         <w:t>3.4.1 Planifier un entretien</w:t>
       </w:r>
@@ -8367,7 +8409,7 @@
       <w:pPr>
         <w:pStyle w:val="Titre3"/>
       </w:pPr>
-      <w:bookmarkStart w:id="37" w:name="_Toc237210794"/>
+      <w:bookmarkStart w:id="37" w:name="_Toc237211653"/>
       <w:r>
         <w:t>3.4.2 Décision finale de recrutement</w:t>
       </w:r>
@@ -8414,7 +8456,7 @@
       <w:pPr>
         <w:pStyle w:val="Titre2"/>
       </w:pPr>
-      <w:bookmarkStart w:id="38" w:name="_Toc237210795"/>
+      <w:bookmarkStart w:id="38" w:name="_Toc237211654"/>
       <w:r>
         <w:t>3.5 Diagramme d'états — Cycle de vie d'une candidature</w:t>
       </w:r>
@@ -8468,10 +8510,15 @@
       </w:r>
     </w:p>
     <w:p>
+      <w:r>
+        <w:t>Le cheminement d'une candidature à travers le scoring IA peut se résumer ainsi : CV candidat → extraction du texte du CV → agent n8n (CV Parser) → appel de l'API Cohere → analyse sémantique et scoring → score global sur 100 → orientation automatique vers CV_REVIEWED (score supérieur ou égal à 60) ou AUTO_REJECTED (score inférieur à 60) → validation humaine possible, le RH ou l'Administrateur pouvant corriger le score via le mécanisme de surcharge.</w:t>
+      </w:r>
+    </w:p>
+    <w:p>
       <w:pPr>
         <w:pStyle w:val="Titre2"/>
       </w:pPr>
-      <w:bookmarkStart w:id="39" w:name="_Toc237210796"/>
+      <w:bookmarkStart w:id="39" w:name="_Toc237211655"/>
       <w:r>
         <w:t>3.6 Conception de la base de données</w:t>
       </w:r>
@@ -8545,7 +8592,7 @@
       <w:pPr>
         <w:pStyle w:val="Titre2"/>
       </w:pPr>
-      <w:bookmarkStart w:id="40" w:name="_Toc237210797"/>
+      <w:bookmarkStart w:id="40" w:name="_Toc237211656"/>
       <w:r>
         <w:t>3.7 Diagramme de déploiement</w:t>
       </w:r>
@@ -8597,7 +8644,7 @@
       <w:pPr>
         <w:pStyle w:val="Titre2"/>
       </w:pPr>
-      <w:bookmarkStart w:id="41" w:name="_Toc237210798"/>
+      <w:bookmarkStart w:id="41" w:name="_Toc237211657"/>
       <w:r>
         <w:t>3.8 Diagramme de composants</w:t>
       </w:r>
@@ -8649,7 +8696,7 @@
       <w:pPr>
         <w:pStyle w:val="Titre2"/>
       </w:pPr>
-      <w:bookmarkStart w:id="42" w:name="_Toc237210799"/>
+      <w:bookmarkStart w:id="42" w:name="_Toc237211658"/>
       <w:r>
         <w:t>3.9 Conclusion</w:t>
       </w:r>
@@ -8672,7 +8719,7 @@
       <w:pPr>
         <w:pStyle w:val="Titre1"/>
       </w:pPr>
-      <w:bookmarkStart w:id="43" w:name="_Toc237210800"/>
+      <w:bookmarkStart w:id="43" w:name="_Toc237211659"/>
       <w:r>
         <w:t>Chapitre 4 : Réalisation</w:t>
       </w:r>
@@ -8687,7 +8734,7 @@
       <w:pPr>
         <w:pStyle w:val="Titre2"/>
       </w:pPr>
-      <w:bookmarkStart w:id="44" w:name="_Toc237210801"/>
+      <w:bookmarkStart w:id="44" w:name="_Toc237211660"/>
       <w:r>
         <w:t>4.1 Introduction</w:t>
       </w:r>
@@ -8702,7 +8749,7 @@
       <w:pPr>
         <w:pStyle w:val="Titre2"/>
       </w:pPr>
-      <w:bookmarkStart w:id="45" w:name="_Toc237210802"/>
+      <w:bookmarkStart w:id="45" w:name="_Toc237211661"/>
       <w:r>
         <w:t>4.2 Environnement de travail</w:t>
       </w:r>
@@ -8712,7 +8759,7 @@
       <w:pPr>
         <w:pStyle w:val="Titre3"/>
       </w:pPr>
-      <w:bookmarkStart w:id="46" w:name="_Toc237210803"/>
+      <w:bookmarkStart w:id="46" w:name="_Toc237211662"/>
       <w:r>
         <w:t>4.2.1 Environnement matériel</w:t>
       </w:r>
@@ -8727,7 +8774,7 @@
       <w:pPr>
         <w:pStyle w:val="Titre3"/>
       </w:pPr>
-      <w:bookmarkStart w:id="47" w:name="_Toc237210804"/>
+      <w:bookmarkStart w:id="47" w:name="_Toc237211663"/>
       <w:r>
         <w:t>4.2.2 Environnement logiciel</w:t>
       </w:r>
@@ -8850,7 +8897,7 @@
       <w:pPr>
         <w:pStyle w:val="Titre3"/>
       </w:pPr>
-      <w:bookmarkStart w:id="48" w:name="_Toc237210805"/>
+      <w:bookmarkStart w:id="48" w:name="_Toc237211664"/>
       <w:r>
         <w:t>4.2.3 Autres</w:t>
       </w:r>
@@ -8865,7 +8912,7 @@
       <w:pPr>
         <w:pStyle w:val="Titre3"/>
       </w:pPr>
-      <w:bookmarkStart w:id="49" w:name="_Toc237210806"/>
+      <w:bookmarkStart w:id="49" w:name="_Toc237211665"/>
       <w:r>
         <w:t>4.2.4 Sécurité applicative</w:t>
       </w:r>
@@ -8873,7 +8920,13 @@
     </w:p>
     <w:p>
       <w:r>
-        <w:t xml:space="preserve">Plusieurs mécanismes concrets protègent la plateforme et les données des candidats. Les mots de passe ne sont jamais stockés en clair : ils sont hachés avec BCrypt avant persistance. L'authentification repose sur un jeton JWT signé, valable 24 heures, transmis à chaque requête et vérifié côté backend pour en extraire l'identité et les rôles de l'utilisateur. Chaque point d'entrée de l'API REST est protégé par annotation selon le rôle requis (@PreAuthorize), et un contrôle d'accès supplémentaire restreint, pour un manager, la visibilité aux seuls candidats relevant de son périmètre </w:t>
+        <w:t xml:space="preserve">Plusieurs mécanismes concrets protègent la plateforme et les données des candidats. Les mots de passe ne sont jamais stockés en clair : ils sont hachés avec BCrypt avant persistance. L'authentification repose sur un </w:t>
+      </w:r>
+      <w:r>
+        <w:t>jeton JWT signé [5], valable 24</w:t>
+      </w:r>
+      <w:r>
+        <w:t xml:space="preserve"> heures, transmis à chaque requête et vérifié côté backend pour en extraire l'identité et les rôles de l'utilisateur. Chaque point d'entrée de l'API REST est protégé par annotation selon le rôle requis (@PreAuthorize), et un contrôle d'accès supplémentaire restreint, pour un manager, la visibilité aux seuls candidats relevant de son périmètre </w:t>
       </w:r>
       <w:r>
         <w:t>(déterminé prioritairement par son département ; la famille de métier ne sert de repli que pour les offres non rattachées à un département)</w:t>
@@ -8882,14 +8935,20 @@
         <w:t>. Le dépôt de CV est limité aux formats PDF, DOC et DOCX, avec une taille maximale de 10 Mo, afin de limiter les risques liés au téléversement de fichiers.</w:t>
       </w:r>
       <w:r>
-        <w:t xml:space="preserve"> Des mécanismes complémentaires, tels que l'analyse antivirus et la validation approfondie du contenu au-delà de la seule extension et du type MIME, pourraient compléter ce dispositif dans une version de production, conformément aux recommandations de l'OWASP.</w:t>
+        <w:t xml:space="preserve"> Des mécanismes complémentaires, tels que l'analyse antivirus et la validation approfondie du contenu au-delà de la seule extension et du type MIME, pourraient compléter ce dispositif dans une version de production, conformément aux </w:t>
+      </w:r>
+      <w:r>
+        <w:t>recommandations de l’OWASP [11]</w:t>
+      </w:r>
+      <w:r>
+        <w:t>.</w:t>
       </w:r>
     </w:p>
     <w:p>
       <w:pPr>
         <w:pStyle w:val="Titre2"/>
       </w:pPr>
-      <w:bookmarkStart w:id="50" w:name="_Toc237210807"/>
+      <w:bookmarkStart w:id="50" w:name="_Toc237211666"/>
       <w:r>
         <w:t>4.3 Interfaces graphiques de l'application</w:t>
       </w:r>
@@ -9311,7 +9370,7 @@
       <w:pPr>
         <w:pStyle w:val="Titre2"/>
       </w:pPr>
-      <w:bookmarkStart w:id="51" w:name="_Toc237210808"/>
+      <w:bookmarkStart w:id="51" w:name="_Toc237211667"/>
       <w:r>
         <w:t>4.4 Tests</w:t>
       </w:r>
@@ -9321,7 +9380,7 @@
       <w:pPr>
         <w:pStyle w:val="Titre3"/>
       </w:pPr>
-      <w:bookmarkStart w:id="52" w:name="_Toc237210809"/>
+      <w:bookmarkStart w:id="52" w:name="_Toc237211668"/>
       <w:r>
         <w:t>4.4.1 Tests unitaires (JUnit 5 / Mockito)</w:t>
       </w:r>
@@ -9568,7 +9627,7 @@
       <w:pPr>
         <w:pStyle w:val="Titre3"/>
       </w:pPr>
-      <w:bookmarkStart w:id="53" w:name="_Toc237210810"/>
+      <w:bookmarkStart w:id="53" w:name="_Toc237211669"/>
       <w:r>
         <w:t>4.4.2 Tests fonctionnels manuels</w:t>
       </w:r>
@@ -10481,7 +10540,7 @@
       <w:pPr>
         <w:pStyle w:val="Titre3"/>
       </w:pPr>
-      <w:bookmarkStart w:id="54" w:name="_Toc237210811"/>
+      <w:bookmarkStart w:id="54" w:name="_Toc237211670"/>
       <w:r>
         <w:t>4.4.3 Tests des API avec Postman et Swagger</w:t>
       </w:r>
@@ -10496,7 +10555,7 @@
       <w:pPr>
         <w:pStyle w:val="Titre3"/>
       </w:pPr>
-      <w:bookmarkStart w:id="55" w:name="_Toc237210812"/>
+      <w:bookmarkStart w:id="55" w:name="_Toc237211671"/>
       <w:r>
         <w:t>4.4.4 Vérification de bout en bout</w:t>
       </w:r>
@@ -10511,7 +10570,7 @@
       <w:pPr>
         <w:pStyle w:val="Titre2"/>
       </w:pPr>
-      <w:bookmarkStart w:id="56" w:name="_Toc237210813"/>
+      <w:bookmarkStart w:id="56" w:name="_Toc237211672"/>
       <w:r>
         <w:t>4.5 Difficultés rencontrées et solutions apportées</w:t>
       </w:r>
@@ -10532,7 +10591,7 @@
       <w:pPr>
         <w:pStyle w:val="Titre3"/>
       </w:pPr>
-      <w:bookmarkStart w:id="57" w:name="_Toc237210814"/>
+      <w:bookmarkStart w:id="57" w:name="_Toc237211673"/>
       <w:r>
         <w:t>4.5.1 Notification incomplète des managers</w:t>
       </w:r>
@@ -10550,7 +10609,7 @@
       <w:pPr>
         <w:pStyle w:val="Titre3"/>
       </w:pPr>
-      <w:bookmarkStart w:id="58" w:name="_Toc237210815"/>
+      <w:bookmarkStart w:id="58" w:name="_Toc237211674"/>
       <w:r>
         <w:t>4.5.2 Distinguer un rejet RH d'un rejet manager</w:t>
       </w:r>
@@ -10565,7 +10624,7 @@
       <w:pPr>
         <w:pStyle w:val="Titre3"/>
       </w:pPr>
-      <w:bookmarkStart w:id="59" w:name="_Toc237210816"/>
+      <w:bookmarkStart w:id="59" w:name="_Toc237211675"/>
       <w:r>
         <w:t>4.5.3 Cohérence des transitions de statut</w:t>
       </w:r>
@@ -10580,7 +10639,7 @@
       <w:pPr>
         <w:pStyle w:val="Titre3"/>
       </w:pPr>
-      <w:bookmarkStart w:id="60" w:name="_Toc237210817"/>
+      <w:bookmarkStart w:id="60" w:name="_Toc237211676"/>
       <w:r>
         <w:t>4.5.4 Filtrage incomplet des routes de lecture pour les managers</w:t>
       </w:r>
@@ -10595,7 +10654,7 @@
       <w:pPr>
         <w:pStyle w:val="Titre3"/>
       </w:pPr>
-      <w:bookmarkStart w:id="61" w:name="_Toc237210818"/>
+      <w:bookmarkStart w:id="61" w:name="_Toc237211677"/>
       <w:r>
         <w:t>4.5.5 Solliciter le manager au bon moment du processus</w:t>
       </w:r>
@@ -10613,7 +10672,7 @@
       <w:pPr>
         <w:pStyle w:val="Titre3"/>
       </w:pPr>
-      <w:bookmarkStart w:id="62" w:name="_Toc237210819"/>
+      <w:bookmarkStart w:id="62" w:name="_Toc237211678"/>
       <w:r>
         <w:t>4.5.6 Pertinence du matching Job idéal</w:t>
       </w:r>
@@ -10631,7 +10690,7 @@
       <w:pPr>
         <w:pStyle w:val="Titre3"/>
       </w:pPr>
-      <w:bookmarkStart w:id="63" w:name="_Toc237210820"/>
+      <w:bookmarkStart w:id="63" w:name="_Toc237211679"/>
       <w:r>
         <w:t>4.5.7 Traitement distinct des candidatures retirées</w:t>
       </w:r>
@@ -10649,7 +10708,7 @@
       <w:pPr>
         <w:pStyle w:val="Titre2"/>
       </w:pPr>
-      <w:bookmarkStart w:id="64" w:name="_Toc237210821"/>
+      <w:bookmarkStart w:id="64" w:name="_Toc237211680"/>
       <w:r>
         <w:t>4.6 Protection des données et éthique de l'IA</w:t>
       </w:r>
@@ -10662,7 +10721,13 @@
     </w:p>
     <w:p>
       <w:r>
-        <w:t>Le score attribué par l'agent d'intelligence artificielle constitue une aide à la présélection et non une décision autonome : comme détaillé au chapitre 3, un score insuffisant déclenche un rejet automatique, mais celui-ci reste réversible par un RH ou un Administrateur via le mécanisme de surcharge manuelle, avec justification obligatoire et traçabilité complète. Cette conception vise à limiter le risque d'erreur ou de biais algorithmique en conservant un contrôle humain sur toute décision affectant un candidat, dans l'esprit des principes du RGPD relatifs aux décisions individuelles automatisées.</w:t>
+        <w:t xml:space="preserve">Le score attribué par l'agent d'intelligence artificielle constitue une aide à la présélection et non une décision autonome : comme détaillé au chapitre 3, un score insuffisant déclenche un rejet automatique, mais celui-ci reste réversible par un RH ou un Administrateur via le mécanisme de surcharge manuelle, avec justification obligatoire et traçabilité complète. Cette conception vise à limiter le risque d'erreur ou de biais algorithmique en conservant un contrôle humain sur toute décision affectant un candidat, dans l'esprit des </w:t>
+      </w:r>
+      <w:r>
+        <w:t>principes du RGPD [10] relatifs</w:t>
+      </w:r>
+      <w:r>
+        <w:t xml:space="preserve"> aux décisions individuelles automatisées.</w:t>
       </w:r>
     </w:p>
     <w:p>
@@ -10679,7 +10744,7 @@
       <w:pPr>
         <w:pStyle w:val="Titre2"/>
       </w:pPr>
-      <w:bookmarkStart w:id="65" w:name="_Toc237210822"/>
+      <w:bookmarkStart w:id="65" w:name="_Toc237211681"/>
       <w:r>
         <w:t>4.7 Bilan des fonctionnalités réalisées</w:t>
       </w:r>
@@ -11204,7 +11269,7 @@
       <w:pPr>
         <w:pStyle w:val="Titre2"/>
       </w:pPr>
-      <w:bookmarkStart w:id="66" w:name="_Toc237210823"/>
+      <w:bookmarkStart w:id="66" w:name="_Toc237211682"/>
       <w:r>
         <w:t>4.8 Conclusion</w:t>
       </w:r>
@@ -11228,7 +11293,7 @@
         <w:pStyle w:val="Titre1"/>
         <w:jc w:val="center"/>
       </w:pPr>
-      <w:bookmarkStart w:id="67" w:name="_Toc237210824"/>
+      <w:bookmarkStart w:id="67" w:name="_Toc237211683"/>
       <w:r>
         <w:t>Conclusion Générale et Perspectives</w:t>
       </w:r>
@@ -11291,7 +11356,7 @@
       <w:pPr>
         <w:pStyle w:val="Titre1"/>
       </w:pPr>
-      <w:bookmarkStart w:id="68" w:name="_Toc237210825"/>
+      <w:bookmarkStart w:id="68" w:name="_Toc237211684"/>
       <w:r>
         <w:t>Bibliographie</w:t>
       </w:r>
@@ -11306,7 +11371,10 @@
         </w:numPr>
       </w:pPr>
       <w:r>
-        <w:t>Spring Boot Reference Documentation. Disponible sur : https://docs.spring.io/spring-boot/. Consulté le 03/08/2026.</w:t>
+        <w:t>[1] Spring Boot Reference Documentation</w:t>
+      </w:r>
+      <w:r>
+        <w:t>. Disponible sur : https://docs.spring.io/spring-boot/. Consulté le 03/08/2026.</w:t>
       </w:r>
     </w:p>
     <w:p>
@@ -11318,7 +11386,10 @@
         </w:numPr>
       </w:pPr>
       <w:r>
-        <w:t>Spring Security Reference Documentation. Disponible sur : https://docs.spring.io/spring-security/reference/. Consulté le 03/08/2026.</w:t>
+        <w:t>[2] Spring Security Reference Documentation</w:t>
+      </w:r>
+      <w:r>
+        <w:t>. Disponible sur : https://docs.spring.io/spring-security/reference/. Consulté le 03/08/2026.</w:t>
       </w:r>
     </w:p>
     <w:p>
@@ -11330,7 +11401,10 @@
         </w:numPr>
       </w:pPr>
       <w:r>
-        <w:t>Angular Documentation. Disponible sur : https://angular.dev. Consulté le 03/08/2026.</w:t>
+        <w:t>[3] Angular Documentation</w:t>
+      </w:r>
+      <w:r>
+        <w:t>. Disponible sur : https://angular.dev. Consulté le 03/08/2026.</w:t>
       </w:r>
     </w:p>
     <w:p>
@@ -11342,7 +11416,10 @@
         </w:numPr>
       </w:pPr>
       <w:r>
-        <w:t>PostgreSQL Documentation. Disponible sur : https://www.postgresql.org/docs/. Consulté le 03/08/2026.</w:t>
+        <w:t>[4] PostgreSQL Documentation</w:t>
+      </w:r>
+      <w:r>
+        <w:t>. Disponible sur : https://www.postgresql.org/docs/. Consulté le 03/08/2026.</w:t>
       </w:r>
     </w:p>
     <w:p>
@@ -11354,7 +11431,10 @@
         </w:numPr>
       </w:pPr>
       <w:r>
-        <w:t>JSON Web Token (JWT) — RFC 7519. Disponible sur : https://www.rfc-editor.org/rfc/rfc7519. Consulté le 03/08/2026.</w:t>
+        <w:t>[5] JSON Web Token (JWT)</w:t>
+      </w:r>
+      <w:r>
+        <w:t xml:space="preserve"> — RFC 7519. Disponible sur : https://www.rfc-editor.org/rfc/rfc7519. Consulté le 03/08/2026.</w:t>
       </w:r>
     </w:p>
     <w:p>
@@ -11366,7 +11446,10 @@
         </w:numPr>
       </w:pPr>
       <w:r>
-        <w:t>Cohere API Documentation. Disponible sur : https://docs.cohere.com. Consulté le 03/08/2026.</w:t>
+        <w:t>[6] Cohere API Documentation</w:t>
+      </w:r>
+      <w:r>
+        <w:t>. Disponible sur : https://docs.cohere.com. Consulté le 03/08/2026.</w:t>
       </w:r>
     </w:p>
     <w:p>
@@ -11378,7 +11461,10 @@
         </w:numPr>
       </w:pPr>
       <w:r>
-        <w:t>n8n Documentation. Disponible sur : https://docs.n8n.io. Consulté le 03/08/2026.</w:t>
+        <w:t>[7] n8n Documentation</w:t>
+      </w:r>
+      <w:r>
+        <w:t>. Disponible sur : https://docs.n8n.io. Consulté le 03/08/2026.</w:t>
       </w:r>
     </w:p>
     <w:p>
@@ -11390,7 +11476,10 @@
         </w:numPr>
       </w:pPr>
       <w:r>
-        <w:t>OMG — Unified Modeling Language (UML) Specification. Disponible sur : https://www.omg.org/spec/UML. Consulté le 03/08/2026.</w:t>
+        <w:t>[8] OMG — Unified Modeling Language</w:t>
+      </w:r>
+      <w:r>
+        <w:t xml:space="preserve"> (UML) Specification. Disponible sur : https://www.omg.org/spec/UML. Consulté le 03/08/2026.</w:t>
       </w:r>
     </w:p>
     <w:p>
@@ -11402,7 +11491,10 @@
         </w:numPr>
       </w:pPr>
       <w:r>
-        <w:t>CNIL — Intelligence artificielle et RGPD, fiches pratiques. Disponible sur : https://www.cnil.fr/fr/intelligence-artificielle. Consulté le 03/08/2026.</w:t>
+        <w:t>[9] CNIL — Intelligence artificielle</w:t>
+      </w:r>
+      <w:r>
+        <w:t xml:space="preserve"> et RGPD, fiches pratiques. Disponible sur : https://www.cnil.fr/fr/intelligence-artificielle. Consulté le 03/08/2026.</w:t>
       </w:r>
     </w:p>
     <w:p>
@@ -11414,7 +11506,10 @@
         </w:numPr>
       </w:pPr>
       <w:r>
-        <w:t>Règlement (UE) 2016/679 (RGPD), article 22 — Décision individuelle automatisée. Disponible sur : https://eur-lex.europa.eu/eli/reg/2016/679/oj. Consulté le 03/08/2026.</w:t>
+        <w:t>[10] Règlement (UE) 2016/679</w:t>
+      </w:r>
+      <w:r>
+        <w:t xml:space="preserve"> (RGPD), article 22 — Décision individuelle automatisée. Disponible sur : https://eur-lex.europa.eu/eli/reg/2016/679/oj. Consulté le 03/08/2026.</w:t>
       </w:r>
     </w:p>
     <w:p>
@@ -11426,7 +11521,10 @@
         </w:numPr>
       </w:pPr>
       <w:r>
-        <w:t>OWASP Top 10 — Application Security Risks. Disponible sur : https://owasp.org/www-project-top-ten/. Consulté le 03/08/2026.</w:t>
+        <w:t>[11] OWASP Top 10</w:t>
+      </w:r>
+      <w:r>
+        <w:t xml:space="preserve"> — Application Security Risks. Disponible sur : https://owasp.org/www-project-top-ten/. Consulté le 03/08/2026.</w:t>
       </w:r>
     </w:p>
     <w:p>
@@ -11438,7 +11536,10 @@
         </w:numPr>
       </w:pPr>
       <w:r>
-        <w:t>WALLS, Craig. Spring Boot in Action. Manning Publications, 2015.</w:t>
+        <w:t>[12] WALLS, Craig</w:t>
+      </w:r>
+      <w:r>
+        <w:t>. Spring Boot in Action. Manning Publications, 2015.</w:t>
       </w:r>
     </w:p>
     <w:p>
@@ -11450,7 +11551,10 @@
         </w:numPr>
       </w:pPr>
       <w:r>
-        <w:t>FREEMAN, Adam. Pro Angular. 3e édition, Apress, 2019.</w:t>
+        <w:t>[13] FREEMAN, Adam</w:t>
+      </w:r>
+      <w:r>
+        <w:t>. Pro Angular. 3e édition, Apress, 2019.</w:t>
       </w:r>
     </w:p>
     <w:p>
@@ -11462,7 +11566,10 @@
         </w:numPr>
       </w:pPr>
       <w:r>
-        <w:t>ISO 30415:2021 — Management des ressources humaines : Diversité et inclusion.</w:t>
+        <w:t>[14] ISO 30415:2021</w:t>
+      </w:r>
+      <w:r>
+        <w:t xml:space="preserve"> — Management des ressources humaines : Diversité et inclusion.</w:t>
       </w:r>
     </w:p>
     <w:p>
@@ -11477,7 +11584,7 @@
       <w:pPr>
         <w:pStyle w:val="Titre1"/>
       </w:pPr>
-      <w:bookmarkStart w:id="69" w:name="_Toc237210826"/>
+      <w:bookmarkStart w:id="69" w:name="_Toc237211685"/>
       <w:r>
         <w:t>Glossaire</w:t>
       </w:r>

</xml_diff>

<commit_message>
docs: rapport PFE - bibliographie 100% citee ([9],[12],[13],[14] ancres dans le texte)
- [12] Spring Boot in Action cite pres de [1], [13] Pro Angular pres de [3]
- [14] ISO 30415 cite via une phrase sur la diversite/non-discrimination (ethique IA)
- [9] CNIL cite avec [10] sur les principes RGPD
- Les 14 references sont desormais citees dans le corps ; 46 pages, listes coherentes

Co-Authored-By: Claude Sonnet 5 <noreply@anthropic.com>
</commit_message>
<xml_diff>
--- a/Rapport-PFE/Rapport_PFE_Bargaoui_Haythem.docx
+++ b/Rapport-PFE/Rapport_PFE_Bargaoui_Haythem.docx
@@ -805,7 +805,7 @@
         <w:pStyle w:val="Titre1"/>
         <w:jc w:val="center"/>
       </w:pPr>
-      <w:bookmarkStart w:id="0" w:name="_Toc237211616"/>
+      <w:bookmarkStart w:id="0" w:name="_Toc237212536"/>
       <w:r>
         <w:t>Table des matières</w:t>
       </w:r>
@@ -855,7 +855,7 @@
         <w:rPr>
           <w:noProof/>
         </w:rPr>
-        <w:instrText xml:space="preserve"> PAGEREF _Toc237211616 \h </w:instrText>
+        <w:instrText xml:space="preserve"> PAGEREF _Toc237212536 \h </w:instrText>
       </w:r>
       <w:r>
         <w:rPr>
@@ -916,7 +916,7 @@
         <w:rPr>
           <w:noProof/>
         </w:rPr>
-        <w:instrText xml:space="preserve"> PAGEREF _Toc237211617 \h </w:instrText>
+        <w:instrText xml:space="preserve"> PAGEREF _Toc237212537 \h </w:instrText>
       </w:r>
       <w:r>
         <w:rPr>
@@ -977,7 +977,7 @@
         <w:rPr>
           <w:noProof/>
         </w:rPr>
-        <w:instrText xml:space="preserve"> PAGEREF _Toc237211618 \h </w:instrText>
+        <w:instrText xml:space="preserve"> PAGEREF _Toc237212538 \h </w:instrText>
       </w:r>
       <w:r>
         <w:rPr>
@@ -1038,7 +1038,7 @@
         <w:rPr>
           <w:noProof/>
         </w:rPr>
-        <w:instrText xml:space="preserve"> PAGEREF _Toc237211619 \h </w:instrText>
+        <w:instrText xml:space="preserve"> PAGEREF _Toc237212539 \h </w:instrText>
       </w:r>
       <w:r>
         <w:rPr>
@@ -1099,7 +1099,7 @@
         <w:rPr>
           <w:noProof/>
         </w:rPr>
-        <w:instrText xml:space="preserve"> PAGEREF _Toc237211620 \h </w:instrText>
+        <w:instrText xml:space="preserve"> PAGEREF _Toc237212540 \h </w:instrText>
       </w:r>
       <w:r>
         <w:rPr>
@@ -1160,7 +1160,7 @@
         <w:rPr>
           <w:noProof/>
         </w:rPr>
-        <w:instrText xml:space="preserve"> PAGEREF _Toc237211621 \h </w:instrText>
+        <w:instrText xml:space="preserve"> PAGEREF _Toc237212541 \h </w:instrText>
       </w:r>
       <w:r>
         <w:rPr>
@@ -1221,7 +1221,7 @@
         <w:rPr>
           <w:noProof/>
         </w:rPr>
-        <w:instrText xml:space="preserve"> PAGEREF _Toc237211622 \h </w:instrText>
+        <w:instrText xml:space="preserve"> PAGEREF _Toc237212542 \h </w:instrText>
       </w:r>
       <w:r>
         <w:rPr>
@@ -1282,7 +1282,7 @@
         <w:rPr>
           <w:noProof/>
         </w:rPr>
-        <w:instrText xml:space="preserve"> PAGEREF _Toc237211623 \h </w:instrText>
+        <w:instrText xml:space="preserve"> PAGEREF _Toc237212543 \h </w:instrText>
       </w:r>
       <w:r>
         <w:rPr>
@@ -1343,7 +1343,7 @@
         <w:rPr>
           <w:noProof/>
         </w:rPr>
-        <w:instrText xml:space="preserve"> PAGEREF _Toc237211624 \h </w:instrText>
+        <w:instrText xml:space="preserve"> PAGEREF _Toc237212544 \h </w:instrText>
       </w:r>
       <w:r>
         <w:rPr>
@@ -1404,7 +1404,7 @@
         <w:rPr>
           <w:noProof/>
         </w:rPr>
-        <w:instrText xml:space="preserve"> PAGEREF _Toc237211625 \h </w:instrText>
+        <w:instrText xml:space="preserve"> PAGEREF _Toc237212545 \h </w:instrText>
       </w:r>
       <w:r>
         <w:rPr>
@@ -1465,7 +1465,7 @@
         <w:rPr>
           <w:noProof/>
         </w:rPr>
-        <w:instrText xml:space="preserve"> PAGEREF _Toc237211626 \h </w:instrText>
+        <w:instrText xml:space="preserve"> PAGEREF _Toc237212546 \h </w:instrText>
       </w:r>
       <w:r>
         <w:rPr>
@@ -1526,7 +1526,7 @@
         <w:rPr>
           <w:noProof/>
         </w:rPr>
-        <w:instrText xml:space="preserve"> PAGEREF _Toc237211627 \h </w:instrText>
+        <w:instrText xml:space="preserve"> PAGEREF _Toc237212547 \h </w:instrText>
       </w:r>
       <w:r>
         <w:rPr>
@@ -1587,7 +1587,7 @@
         <w:rPr>
           <w:noProof/>
         </w:rPr>
-        <w:instrText xml:space="preserve"> PAGEREF _Toc237211628 \h </w:instrText>
+        <w:instrText xml:space="preserve"> PAGEREF _Toc237212548 \h </w:instrText>
       </w:r>
       <w:r>
         <w:rPr>
@@ -1648,7 +1648,7 @@
         <w:rPr>
           <w:noProof/>
         </w:rPr>
-        <w:instrText xml:space="preserve"> PAGEREF _Toc237211629 \h </w:instrText>
+        <w:instrText xml:space="preserve"> PAGEREF _Toc237212549 \h </w:instrText>
       </w:r>
       <w:r>
         <w:rPr>
@@ -1709,7 +1709,7 @@
         <w:rPr>
           <w:noProof/>
         </w:rPr>
-        <w:instrText xml:space="preserve"> PAGEREF _Toc237211630 \h </w:instrText>
+        <w:instrText xml:space="preserve"> PAGEREF _Toc237212550 \h </w:instrText>
       </w:r>
       <w:r>
         <w:rPr>
@@ -1770,7 +1770,7 @@
         <w:rPr>
           <w:noProof/>
         </w:rPr>
-        <w:instrText xml:space="preserve"> PAGEREF _Toc237211631 \h </w:instrText>
+        <w:instrText xml:space="preserve"> PAGEREF _Toc237212551 \h </w:instrText>
       </w:r>
       <w:r>
         <w:rPr>
@@ -1831,7 +1831,7 @@
         <w:rPr>
           <w:noProof/>
         </w:rPr>
-        <w:instrText xml:space="preserve"> PAGEREF _Toc237211632 \h </w:instrText>
+        <w:instrText xml:space="preserve"> PAGEREF _Toc237212552 \h </w:instrText>
       </w:r>
       <w:r>
         <w:rPr>
@@ -1892,7 +1892,7 @@
         <w:rPr>
           <w:noProof/>
         </w:rPr>
-        <w:instrText xml:space="preserve"> PAGEREF _Toc237211633 \h </w:instrText>
+        <w:instrText xml:space="preserve"> PAGEREF _Toc237212553 \h </w:instrText>
       </w:r>
       <w:r>
         <w:rPr>
@@ -1953,7 +1953,7 @@
         <w:rPr>
           <w:noProof/>
         </w:rPr>
-        <w:instrText xml:space="preserve"> PAGEREF _Toc237211634 \h </w:instrText>
+        <w:instrText xml:space="preserve"> PAGEREF _Toc237212554 \h </w:instrText>
       </w:r>
       <w:r>
         <w:rPr>
@@ -2014,7 +2014,7 @@
         <w:rPr>
           <w:noProof/>
         </w:rPr>
-        <w:instrText xml:space="preserve"> PAGEREF _Toc237211635 \h </w:instrText>
+        <w:instrText xml:space="preserve"> PAGEREF _Toc237212555 \h </w:instrText>
       </w:r>
       <w:r>
         <w:rPr>
@@ -2075,7 +2075,7 @@
         <w:rPr>
           <w:noProof/>
         </w:rPr>
-        <w:instrText xml:space="preserve"> PAGEREF _Toc237211636 \h </w:instrText>
+        <w:instrText xml:space="preserve"> PAGEREF _Toc237212556 \h </w:instrText>
       </w:r>
       <w:r>
         <w:rPr>
@@ -2136,7 +2136,7 @@
         <w:rPr>
           <w:noProof/>
         </w:rPr>
-        <w:instrText xml:space="preserve"> PAGEREF _Toc237211637 \h </w:instrText>
+        <w:instrText xml:space="preserve"> PAGEREF _Toc237212557 \h </w:instrText>
       </w:r>
       <w:r>
         <w:rPr>
@@ -2197,7 +2197,7 @@
         <w:rPr>
           <w:noProof/>
         </w:rPr>
-        <w:instrText xml:space="preserve"> PAGEREF _Toc237211638 \h </w:instrText>
+        <w:instrText xml:space="preserve"> PAGEREF _Toc237212558 \h </w:instrText>
       </w:r>
       <w:r>
         <w:rPr>
@@ -2258,7 +2258,7 @@
         <w:rPr>
           <w:noProof/>
         </w:rPr>
-        <w:instrText xml:space="preserve"> PAGEREF _Toc237211639 \h </w:instrText>
+        <w:instrText xml:space="preserve"> PAGEREF _Toc237212559 \h </w:instrText>
       </w:r>
       <w:r>
         <w:rPr>
@@ -2319,7 +2319,7 @@
         <w:rPr>
           <w:noProof/>
         </w:rPr>
-        <w:instrText xml:space="preserve"> PAGEREF _Toc237211640 \h </w:instrText>
+        <w:instrText xml:space="preserve"> PAGEREF _Toc237212560 \h </w:instrText>
       </w:r>
       <w:r>
         <w:rPr>
@@ -2380,7 +2380,7 @@
         <w:rPr>
           <w:noProof/>
         </w:rPr>
-        <w:instrText xml:space="preserve"> PAGEREF _Toc237211641 \h </w:instrText>
+        <w:instrText xml:space="preserve"> PAGEREF _Toc237212561 \h </w:instrText>
       </w:r>
       <w:r>
         <w:rPr>
@@ -2441,7 +2441,7 @@
         <w:rPr>
           <w:noProof/>
         </w:rPr>
-        <w:instrText xml:space="preserve"> PAGEREF _Toc237211642 \h </w:instrText>
+        <w:instrText xml:space="preserve"> PAGEREF _Toc237212562 \h </w:instrText>
       </w:r>
       <w:r>
         <w:rPr>
@@ -2502,7 +2502,7 @@
         <w:rPr>
           <w:noProof/>
         </w:rPr>
-        <w:instrText xml:space="preserve"> PAGEREF _Toc237211643 \h </w:instrText>
+        <w:instrText xml:space="preserve"> PAGEREF _Toc237212563 \h </w:instrText>
       </w:r>
       <w:r>
         <w:rPr>
@@ -2563,7 +2563,7 @@
         <w:rPr>
           <w:noProof/>
         </w:rPr>
-        <w:instrText xml:space="preserve"> PAGEREF _Toc237211644 \h </w:instrText>
+        <w:instrText xml:space="preserve"> PAGEREF _Toc237212564 \h </w:instrText>
       </w:r>
       <w:r>
         <w:rPr>
@@ -2624,7 +2624,7 @@
         <w:rPr>
           <w:noProof/>
         </w:rPr>
-        <w:instrText xml:space="preserve"> PAGEREF _Toc237211645 \h </w:instrText>
+        <w:instrText xml:space="preserve"> PAGEREF _Toc237212565 \h </w:instrText>
       </w:r>
       <w:r>
         <w:rPr>
@@ -2685,7 +2685,7 @@
         <w:rPr>
           <w:noProof/>
         </w:rPr>
-        <w:instrText xml:space="preserve"> PAGEREF _Toc237211646 \h </w:instrText>
+        <w:instrText xml:space="preserve"> PAGEREF _Toc237212566 \h </w:instrText>
       </w:r>
       <w:r>
         <w:rPr>
@@ -2746,7 +2746,7 @@
         <w:rPr>
           <w:noProof/>
         </w:rPr>
-        <w:instrText xml:space="preserve"> PAGEREF _Toc237211647 \h </w:instrText>
+        <w:instrText xml:space="preserve"> PAGEREF _Toc237212567 \h </w:instrText>
       </w:r>
       <w:r>
         <w:rPr>
@@ -2807,7 +2807,7 @@
         <w:rPr>
           <w:noProof/>
         </w:rPr>
-        <w:instrText xml:space="preserve"> PAGEREF _Toc237211648 \h </w:instrText>
+        <w:instrText xml:space="preserve"> PAGEREF _Toc237212568 \h </w:instrText>
       </w:r>
       <w:r>
         <w:rPr>
@@ -2868,7 +2868,7 @@
         <w:rPr>
           <w:noProof/>
         </w:rPr>
-        <w:instrText xml:space="preserve"> PAGEREF _Toc237211649 \h </w:instrText>
+        <w:instrText xml:space="preserve"> PAGEREF _Toc237212569 \h </w:instrText>
       </w:r>
       <w:r>
         <w:rPr>
@@ -2929,7 +2929,7 @@
         <w:rPr>
           <w:noProof/>
         </w:rPr>
-        <w:instrText xml:space="preserve"> PAGEREF _Toc237211650 \h </w:instrText>
+        <w:instrText xml:space="preserve"> PAGEREF _Toc237212570 \h </w:instrText>
       </w:r>
       <w:r>
         <w:rPr>
@@ -2990,7 +2990,7 @@
         <w:rPr>
           <w:noProof/>
         </w:rPr>
-        <w:instrText xml:space="preserve"> PAGEREF _Toc237211651 \h </w:instrText>
+        <w:instrText xml:space="preserve"> PAGEREF _Toc237212571 \h </w:instrText>
       </w:r>
       <w:r>
         <w:rPr>
@@ -3051,7 +3051,7 @@
         <w:rPr>
           <w:noProof/>
         </w:rPr>
-        <w:instrText xml:space="preserve"> PAGEREF _Toc237211652 \h </w:instrText>
+        <w:instrText xml:space="preserve"> PAGEREF _Toc237212572 \h </w:instrText>
       </w:r>
       <w:r>
         <w:rPr>
@@ -3112,7 +3112,7 @@
         <w:rPr>
           <w:noProof/>
         </w:rPr>
-        <w:instrText xml:space="preserve"> PAGEREF _Toc237211653 \h </w:instrText>
+        <w:instrText xml:space="preserve"> PAGEREF _Toc237212573 \h </w:instrText>
       </w:r>
       <w:r>
         <w:rPr>
@@ -3173,7 +3173,7 @@
         <w:rPr>
           <w:noProof/>
         </w:rPr>
-        <w:instrText xml:space="preserve"> PAGEREF _Toc237211654 \h </w:instrText>
+        <w:instrText xml:space="preserve"> PAGEREF _Toc237212574 \h </w:instrText>
       </w:r>
       <w:r>
         <w:rPr>
@@ -3234,7 +3234,7 @@
         <w:rPr>
           <w:noProof/>
         </w:rPr>
-        <w:instrText xml:space="preserve"> PAGEREF _Toc237211655 \h </w:instrText>
+        <w:instrText xml:space="preserve"> PAGEREF _Toc237212575 \h </w:instrText>
       </w:r>
       <w:r>
         <w:rPr>
@@ -3295,7 +3295,7 @@
         <w:rPr>
           <w:noProof/>
         </w:rPr>
-        <w:instrText xml:space="preserve"> PAGEREF _Toc237211656 \h </w:instrText>
+        <w:instrText xml:space="preserve"> PAGEREF _Toc237212576 \h </w:instrText>
       </w:r>
       <w:r>
         <w:rPr>
@@ -3356,7 +3356,7 @@
         <w:rPr>
           <w:noProof/>
         </w:rPr>
-        <w:instrText xml:space="preserve"> PAGEREF _Toc237211657 \h </w:instrText>
+        <w:instrText xml:space="preserve"> PAGEREF _Toc237212577 \h </w:instrText>
       </w:r>
       <w:r>
         <w:rPr>
@@ -3417,7 +3417,7 @@
         <w:rPr>
           <w:noProof/>
         </w:rPr>
-        <w:instrText xml:space="preserve"> PAGEREF _Toc237211658 \h </w:instrText>
+        <w:instrText xml:space="preserve"> PAGEREF _Toc237212578 \h </w:instrText>
       </w:r>
       <w:r>
         <w:rPr>
@@ -3478,7 +3478,7 @@
         <w:rPr>
           <w:noProof/>
         </w:rPr>
-        <w:instrText xml:space="preserve"> PAGEREF _Toc237211659 \h </w:instrText>
+        <w:instrText xml:space="preserve"> PAGEREF _Toc237212579 \h </w:instrText>
       </w:r>
       <w:r>
         <w:rPr>
@@ -3539,7 +3539,7 @@
         <w:rPr>
           <w:noProof/>
         </w:rPr>
-        <w:instrText xml:space="preserve"> PAGEREF _Toc237211660 \h </w:instrText>
+        <w:instrText xml:space="preserve"> PAGEREF _Toc237212580 \h </w:instrText>
       </w:r>
       <w:r>
         <w:rPr>
@@ -3600,7 +3600,7 @@
         <w:rPr>
           <w:noProof/>
         </w:rPr>
-        <w:instrText xml:space="preserve"> PAGEREF _Toc237211661 \h </w:instrText>
+        <w:instrText xml:space="preserve"> PAGEREF _Toc237212581 \h </w:instrText>
       </w:r>
       <w:r>
         <w:rPr>
@@ -3661,7 +3661,7 @@
         <w:rPr>
           <w:noProof/>
         </w:rPr>
-        <w:instrText xml:space="preserve"> PAGEREF _Toc237211662 \h </w:instrText>
+        <w:instrText xml:space="preserve"> PAGEREF _Toc237212582 \h </w:instrText>
       </w:r>
       <w:r>
         <w:rPr>
@@ -3722,7 +3722,7 @@
         <w:rPr>
           <w:noProof/>
         </w:rPr>
-        <w:instrText xml:space="preserve"> PAGEREF _Toc237211663 \h </w:instrText>
+        <w:instrText xml:space="preserve"> PAGEREF _Toc237212583 \h </w:instrText>
       </w:r>
       <w:r>
         <w:rPr>
@@ -3783,7 +3783,7 @@
         <w:rPr>
           <w:noProof/>
         </w:rPr>
-        <w:instrText xml:space="preserve"> PAGEREF _Toc237211664 \h </w:instrText>
+        <w:instrText xml:space="preserve"> PAGEREF _Toc237212584 \h </w:instrText>
       </w:r>
       <w:r>
         <w:rPr>
@@ -3844,7 +3844,7 @@
         <w:rPr>
           <w:noProof/>
         </w:rPr>
-        <w:instrText xml:space="preserve"> PAGEREF _Toc237211665 \h </w:instrText>
+        <w:instrText xml:space="preserve"> PAGEREF _Toc237212585 \h </w:instrText>
       </w:r>
       <w:r>
         <w:rPr>
@@ -3905,7 +3905,7 @@
         <w:rPr>
           <w:noProof/>
         </w:rPr>
-        <w:instrText xml:space="preserve"> PAGEREF _Toc237211666 \h </w:instrText>
+        <w:instrText xml:space="preserve"> PAGEREF _Toc237212586 \h </w:instrText>
       </w:r>
       <w:r>
         <w:rPr>
@@ -3966,7 +3966,7 @@
         <w:rPr>
           <w:noProof/>
         </w:rPr>
-        <w:instrText xml:space="preserve"> PAGEREF _Toc237211667 \h </w:instrText>
+        <w:instrText xml:space="preserve"> PAGEREF _Toc237212587 \h </w:instrText>
       </w:r>
       <w:r>
         <w:rPr>
@@ -4027,7 +4027,7 @@
         <w:rPr>
           <w:noProof/>
         </w:rPr>
-        <w:instrText xml:space="preserve"> PAGEREF _Toc237211668 \h </w:instrText>
+        <w:instrText xml:space="preserve"> PAGEREF _Toc237212588 \h </w:instrText>
       </w:r>
       <w:r>
         <w:rPr>
@@ -4088,7 +4088,7 @@
         <w:rPr>
           <w:noProof/>
         </w:rPr>
-        <w:instrText xml:space="preserve"> PAGEREF _Toc237211669 \h </w:instrText>
+        <w:instrText xml:space="preserve"> PAGEREF _Toc237212589 \h </w:instrText>
       </w:r>
       <w:r>
         <w:rPr>
@@ -4149,7 +4149,7 @@
         <w:rPr>
           <w:noProof/>
         </w:rPr>
-        <w:instrText xml:space="preserve"> PAGEREF _Toc237211670 \h </w:instrText>
+        <w:instrText xml:space="preserve"> PAGEREF _Toc237212590 \h </w:instrText>
       </w:r>
       <w:r>
         <w:rPr>
@@ -4210,7 +4210,7 @@
         <w:rPr>
           <w:noProof/>
         </w:rPr>
-        <w:instrText xml:space="preserve"> PAGEREF _Toc237211671 \h </w:instrText>
+        <w:instrText xml:space="preserve"> PAGEREF _Toc237212591 \h </w:instrText>
       </w:r>
       <w:r>
         <w:rPr>
@@ -4271,7 +4271,7 @@
         <w:rPr>
           <w:noProof/>
         </w:rPr>
-        <w:instrText xml:space="preserve"> PAGEREF _Toc237211672 \h </w:instrText>
+        <w:instrText xml:space="preserve"> PAGEREF _Toc237212592 \h </w:instrText>
       </w:r>
       <w:r>
         <w:rPr>
@@ -4332,7 +4332,7 @@
         <w:rPr>
           <w:noProof/>
         </w:rPr>
-        <w:instrText xml:space="preserve"> PAGEREF _Toc237211673 \h </w:instrText>
+        <w:instrText xml:space="preserve"> PAGEREF _Toc237212593 \h </w:instrText>
       </w:r>
       <w:r>
         <w:rPr>
@@ -4393,7 +4393,7 @@
         <w:rPr>
           <w:noProof/>
         </w:rPr>
-        <w:instrText xml:space="preserve"> PAGEREF _Toc237211674 \h </w:instrText>
+        <w:instrText xml:space="preserve"> PAGEREF _Toc237212594 \h </w:instrText>
       </w:r>
       <w:r>
         <w:rPr>
@@ -4454,7 +4454,7 @@
         <w:rPr>
           <w:noProof/>
         </w:rPr>
-        <w:instrText xml:space="preserve"> PAGEREF _Toc237211675 \h </w:instrText>
+        <w:instrText xml:space="preserve"> PAGEREF _Toc237212595 \h </w:instrText>
       </w:r>
       <w:r>
         <w:rPr>
@@ -4515,7 +4515,7 @@
         <w:rPr>
           <w:noProof/>
         </w:rPr>
-        <w:instrText xml:space="preserve"> PAGEREF _Toc237211676 \h </w:instrText>
+        <w:instrText xml:space="preserve"> PAGEREF _Toc237212596 \h </w:instrText>
       </w:r>
       <w:r>
         <w:rPr>
@@ -4576,7 +4576,7 @@
         <w:rPr>
           <w:noProof/>
         </w:rPr>
-        <w:instrText xml:space="preserve"> PAGEREF _Toc237211677 \h </w:instrText>
+        <w:instrText xml:space="preserve"> PAGEREF _Toc237212597 \h </w:instrText>
       </w:r>
       <w:r>
         <w:rPr>
@@ -4637,7 +4637,7 @@
         <w:rPr>
           <w:noProof/>
         </w:rPr>
-        <w:instrText xml:space="preserve"> PAGEREF _Toc237211678 \h </w:instrText>
+        <w:instrText xml:space="preserve"> PAGEREF _Toc237212598 \h </w:instrText>
       </w:r>
       <w:r>
         <w:rPr>
@@ -4698,7 +4698,7 @@
         <w:rPr>
           <w:noProof/>
         </w:rPr>
-        <w:instrText xml:space="preserve"> PAGEREF _Toc237211679 \h </w:instrText>
+        <w:instrText xml:space="preserve"> PAGEREF _Toc237212599 \h </w:instrText>
       </w:r>
       <w:r>
         <w:rPr>
@@ -4759,7 +4759,7 @@
         <w:rPr>
           <w:noProof/>
         </w:rPr>
-        <w:instrText xml:space="preserve"> PAGEREF _Toc237211680 \h </w:instrText>
+        <w:instrText xml:space="preserve"> PAGEREF _Toc237212600 \h </w:instrText>
       </w:r>
       <w:r>
         <w:rPr>
@@ -4820,7 +4820,7 @@
         <w:rPr>
           <w:noProof/>
         </w:rPr>
-        <w:instrText xml:space="preserve"> PAGEREF _Toc237211681 \h </w:instrText>
+        <w:instrText xml:space="preserve"> PAGEREF _Toc237212601 \h </w:instrText>
       </w:r>
       <w:r>
         <w:rPr>
@@ -4881,7 +4881,7 @@
         <w:rPr>
           <w:noProof/>
         </w:rPr>
-        <w:instrText xml:space="preserve"> PAGEREF _Toc237211682 \h </w:instrText>
+        <w:instrText xml:space="preserve"> PAGEREF _Toc237212602 \h </w:instrText>
       </w:r>
       <w:r>
         <w:rPr>
@@ -4942,7 +4942,7 @@
         <w:rPr>
           <w:noProof/>
         </w:rPr>
-        <w:instrText xml:space="preserve"> PAGEREF _Toc237211683 \h </w:instrText>
+        <w:instrText xml:space="preserve"> PAGEREF _Toc237212603 \h </w:instrText>
       </w:r>
       <w:r>
         <w:rPr>
@@ -5003,7 +5003,7 @@
         <w:rPr>
           <w:noProof/>
         </w:rPr>
-        <w:instrText xml:space="preserve"> PAGEREF _Toc237211684 \h </w:instrText>
+        <w:instrText xml:space="preserve"> PAGEREF _Toc237212604 \h </w:instrText>
       </w:r>
       <w:r>
         <w:rPr>
@@ -5064,7 +5064,7 @@
         <w:rPr>
           <w:noProof/>
         </w:rPr>
-        <w:instrText xml:space="preserve"> PAGEREF _Toc237211685 \h </w:instrText>
+        <w:instrText xml:space="preserve"> PAGEREF _Toc237212605 \h </w:instrText>
       </w:r>
       <w:r>
         <w:rPr>
@@ -5107,7 +5107,7 @@
       <w:pPr>
         <w:pStyle w:val="Titre1"/>
       </w:pPr>
-      <w:bookmarkStart w:id="1" w:name="_Toc237211617"/>
+      <w:bookmarkStart w:id="1" w:name="_Toc237212537"/>
       <w:r>
         <w:t>Liste des figures</w:t>
       </w:r>
@@ -5436,7 +5436,7 @@
       <w:pPr>
         <w:pStyle w:val="Titre1"/>
       </w:pPr>
-      <w:bookmarkStart w:id="2" w:name="_Toc237211618"/>
+      <w:bookmarkStart w:id="2" w:name="_Toc237212538"/>
       <w:r>
         <w:t>Liste des tableaux</w:t>
       </w:r>
@@ -5500,7 +5500,7 @@
         <w:pStyle w:val="Titre1"/>
         <w:jc w:val="center"/>
       </w:pPr>
-      <w:bookmarkStart w:id="3" w:name="_Toc237211619"/>
+      <w:bookmarkStart w:id="3" w:name="_Toc237212539"/>
       <w:r>
         <w:t>Introduction Générale</w:t>
       </w:r>
@@ -5533,7 +5533,7 @@
       <w:pPr>
         <w:pStyle w:val="Titre1"/>
       </w:pPr>
-      <w:bookmarkStart w:id="4" w:name="_Toc237211620"/>
+      <w:bookmarkStart w:id="4" w:name="_Toc237212540"/>
       <w:r>
         <w:t>Chapitre 1 : Cadre Général du Projet</w:t>
       </w:r>
@@ -5548,7 +5548,7 @@
       <w:pPr>
         <w:pStyle w:val="Titre2"/>
       </w:pPr>
-      <w:bookmarkStart w:id="5" w:name="_Toc237211621"/>
+      <w:bookmarkStart w:id="5" w:name="_Toc237212541"/>
       <w:r>
         <w:t>1.1 Introduction</w:t>
       </w:r>
@@ -5563,7 +5563,7 @@
       <w:pPr>
         <w:pStyle w:val="Titre2"/>
       </w:pPr>
-      <w:bookmarkStart w:id="6" w:name="_Toc237211622"/>
+      <w:bookmarkStart w:id="6" w:name="_Toc237212542"/>
       <w:r>
         <w:t>1.2 Présentation de l'organisme d'accueil</w:t>
       </w:r>
@@ -5573,7 +5573,7 @@
       <w:pPr>
         <w:pStyle w:val="Titre3"/>
       </w:pPr>
-      <w:bookmarkStart w:id="7" w:name="_Toc237211623"/>
+      <w:bookmarkStart w:id="7" w:name="_Toc237212543"/>
       <w:r>
         <w:t>1.2.1 Le groupe Sopra Steria</w:t>
       </w:r>
@@ -5588,7 +5588,7 @@
       <w:pPr>
         <w:pStyle w:val="Titre3"/>
       </w:pPr>
-      <w:bookmarkStart w:id="8" w:name="_Toc237211624"/>
+      <w:bookmarkStart w:id="8" w:name="_Toc237212544"/>
       <w:r>
         <w:t>1.2.2 Sopra HR Software</w:t>
       </w:r>
@@ -5608,7 +5608,7 @@
       <w:pPr>
         <w:pStyle w:val="Titre2"/>
       </w:pPr>
-      <w:bookmarkStart w:id="9" w:name="_Toc237211625"/>
+      <w:bookmarkStart w:id="9" w:name="_Toc237212545"/>
       <w:r>
         <w:t>1.3 Étude de l'existant</w:t>
       </w:r>
@@ -5695,7 +5695,7 @@
       <w:pPr>
         <w:pStyle w:val="Titre2"/>
       </w:pPr>
-      <w:bookmarkStart w:id="10" w:name="_Toc237211626"/>
+      <w:bookmarkStart w:id="10" w:name="_Toc237212546"/>
       <w:r>
         <w:t>1.4 Critique de l'existant et problématique</w:t>
       </w:r>
@@ -5715,7 +5715,7 @@
       <w:pPr>
         <w:pStyle w:val="Titre2"/>
       </w:pPr>
-      <w:bookmarkStart w:id="11" w:name="_Toc237211627"/>
+      <w:bookmarkStart w:id="11" w:name="_Toc237212547"/>
       <w:r>
         <w:t>1.5 Objectifs du projet</w:t>
       </w:r>
@@ -5802,7 +5802,7 @@
       <w:pPr>
         <w:pStyle w:val="Titre2"/>
       </w:pPr>
-      <w:bookmarkStart w:id="12" w:name="_Toc237211628"/>
+      <w:bookmarkStart w:id="12" w:name="_Toc237212548"/>
       <w:r>
         <w:t>1.6 Présentation de la solution proposée : JOB4YOU</w:t>
       </w:r>
@@ -5870,7 +5870,7 @@
       <w:pPr>
         <w:pStyle w:val="Titre2"/>
       </w:pPr>
-      <w:bookmarkStart w:id="13" w:name="_Toc237211629"/>
+      <w:bookmarkStart w:id="13" w:name="_Toc237212549"/>
       <w:r>
         <w:t>1.7 Méthodologie de travail adoptée</w:t>
       </w:r>
@@ -5890,7 +5890,7 @@
       <w:pPr>
         <w:pStyle w:val="Titre2"/>
       </w:pPr>
-      <w:bookmarkStart w:id="14" w:name="_Toc237211630"/>
+      <w:bookmarkStart w:id="14" w:name="_Toc237212550"/>
       <w:r>
         <w:t>1.8 Planification du projet</w:t>
       </w:r>
@@ -6290,7 +6290,7 @@
       <w:pPr>
         <w:pStyle w:val="Titre2"/>
       </w:pPr>
-      <w:bookmarkStart w:id="15" w:name="_Toc237211631"/>
+      <w:bookmarkStart w:id="15" w:name="_Toc237212551"/>
       <w:r>
         <w:t>1.9 Conclusion</w:t>
       </w:r>
@@ -6313,7 +6313,7 @@
       <w:pPr>
         <w:pStyle w:val="Titre1"/>
       </w:pPr>
-      <w:bookmarkStart w:id="16" w:name="_Toc237211632"/>
+      <w:bookmarkStart w:id="16" w:name="_Toc237212552"/>
       <w:r>
         <w:t>Chapitre 2 : Analyse et Spécification des Besoins</w:t>
       </w:r>
@@ -6328,7 +6328,7 @@
       <w:pPr>
         <w:pStyle w:val="Titre2"/>
       </w:pPr>
-      <w:bookmarkStart w:id="17" w:name="_Toc237211633"/>
+      <w:bookmarkStart w:id="17" w:name="_Toc237212553"/>
       <w:r>
         <w:t>2.1 Introduction</w:t>
       </w:r>
@@ -6343,7 +6343,7 @@
       <w:pPr>
         <w:pStyle w:val="Titre2"/>
       </w:pPr>
-      <w:bookmarkStart w:id="18" w:name="_Toc237211634"/>
+      <w:bookmarkStart w:id="18" w:name="_Toc237212554"/>
       <w:r>
         <w:t>2.2 Étude fonctionnelle</w:t>
       </w:r>
@@ -6353,7 +6353,7 @@
       <w:pPr>
         <w:pStyle w:val="Titre3"/>
       </w:pPr>
-      <w:bookmarkStart w:id="19" w:name="_Toc237211635"/>
+      <w:bookmarkStart w:id="19" w:name="_Toc237212555"/>
       <w:r>
         <w:t>2.2.1 Identification des acteurs du système</w:t>
       </w:r>
@@ -7314,7 +7314,7 @@
       <w:pPr>
         <w:pStyle w:val="Titre3"/>
       </w:pPr>
-      <w:bookmarkStart w:id="20" w:name="_Toc237211636"/>
+      <w:bookmarkStart w:id="20" w:name="_Toc237212556"/>
       <w:r>
         <w:t>2.2.2 Identification des besoins fonctionnels</w:t>
       </w:r>
@@ -7461,7 +7461,7 @@
       <w:pPr>
         <w:pStyle w:val="Titre3"/>
       </w:pPr>
-      <w:bookmarkStart w:id="21" w:name="_Toc237211637"/>
+      <w:bookmarkStart w:id="21" w:name="_Toc237212557"/>
       <w:r>
         <w:t>2.2.3 Identification des besoins non fonctionnels</w:t>
       </w:r>
@@ -7548,7 +7548,7 @@
       <w:pPr>
         <w:pStyle w:val="Titre3"/>
       </w:pPr>
-      <w:bookmarkStart w:id="22" w:name="_Toc237211638"/>
+      <w:bookmarkStart w:id="22" w:name="_Toc237212558"/>
       <w:r>
         <w:t>2.2.4 Diagramme de cas d'utilisation</w:t>
       </w:r>
@@ -7597,7 +7597,7 @@
       <w:pPr>
         <w:pStyle w:val="Titre3"/>
       </w:pPr>
-      <w:bookmarkStart w:id="23" w:name="_Toc237211639"/>
+      <w:bookmarkStart w:id="23" w:name="_Toc237212559"/>
       <w:r>
         <w:t>2.2.5 Description textuelle de quelques cas d'utilisation</w:t>
       </w:r>
@@ -7984,7 +7984,7 @@
       <w:pPr>
         <w:pStyle w:val="Titre3"/>
       </w:pPr>
-      <w:bookmarkStart w:id="24" w:name="_Toc237211640"/>
+      <w:bookmarkStart w:id="24" w:name="_Toc237212560"/>
       <w:r>
         <w:t>2.2.6 Diagramme de séquence système</w:t>
       </w:r>
@@ -8031,7 +8031,7 @@
       <w:pPr>
         <w:pStyle w:val="Titre2"/>
       </w:pPr>
-      <w:bookmarkStart w:id="25" w:name="_Toc237211641"/>
+      <w:bookmarkStart w:id="25" w:name="_Toc237212561"/>
       <w:r>
         <w:t>2.3 Étude technique</w:t>
       </w:r>
@@ -8041,7 +8041,7 @@
       <w:pPr>
         <w:pStyle w:val="Titre3"/>
       </w:pPr>
-      <w:bookmarkStart w:id="26" w:name="_Toc237211642"/>
+      <w:bookmarkStart w:id="26" w:name="_Toc237212562"/>
       <w:r>
         <w:t>2.3.1 Architecture physique</w:t>
       </w:r>
@@ -8052,13 +8052,16 @@
         <w:t xml:space="preserve">La plateforme repose sur une architecture distribuée en couches, illustrée par la figure suivante : </w:t>
       </w:r>
       <w:r>
-        <w:t>un frontend Angular [3] consommé par le navigateur</w:t>
+        <w:t>un frontend Angular [3], [13] consommé par le navigateur</w:t>
       </w:r>
       <w:r>
         <w:t xml:space="preserve">, </w:t>
       </w:r>
       <w:r>
-        <w:t>un backend Spring Boot [1] exposant des API REST sécurisées, une base de données PostgreSQL [4]</w:t>
+        <w:t>un backend Spring Boot [1], [12] exposant des API REST sécurisées</w:t>
+      </w:r>
+      <w:r>
+        <w:t>, une base de données PostgreSQL [4]</w:t>
       </w:r>
       <w:r>
         <w:t>, ainsi qu'</w:t>
@@ -8112,7 +8115,7 @@
       <w:pPr>
         <w:pStyle w:val="Titre3"/>
       </w:pPr>
-      <w:bookmarkStart w:id="27" w:name="_Toc237211643"/>
+      <w:bookmarkStart w:id="27" w:name="_Toc237212563"/>
       <w:r>
         <w:t>2.3.2 Côté client — Angular</w:t>
       </w:r>
@@ -8127,7 +8130,7 @@
       <w:pPr>
         <w:pStyle w:val="Titre3"/>
       </w:pPr>
-      <w:bookmarkStart w:id="28" w:name="_Toc237211644"/>
+      <w:bookmarkStart w:id="28" w:name="_Toc237212564"/>
       <w:r>
         <w:t>2.3.3 Côté serveur — Spring Boot</w:t>
       </w:r>
@@ -8142,7 +8145,7 @@
       <w:pPr>
         <w:pStyle w:val="Titre3"/>
       </w:pPr>
-      <w:bookmarkStart w:id="29" w:name="_Toc237211645"/>
+      <w:bookmarkStart w:id="29" w:name="_Toc237212565"/>
       <w:r>
         <w:t>2.3.4 La sécurité — Spring Security et JWT</w:t>
       </w:r>
@@ -8163,7 +8166,7 @@
       <w:pPr>
         <w:pStyle w:val="Titre2"/>
       </w:pPr>
-      <w:bookmarkStart w:id="30" w:name="_Toc237211646"/>
+      <w:bookmarkStart w:id="30" w:name="_Toc237212566"/>
       <w:r>
         <w:t>2.4 Conclusion</w:t>
       </w:r>
@@ -8186,7 +8189,7 @@
       <w:pPr>
         <w:pStyle w:val="Titre1"/>
       </w:pPr>
-      <w:bookmarkStart w:id="31" w:name="_Toc237211647"/>
+      <w:bookmarkStart w:id="31" w:name="_Toc237212567"/>
       <w:r>
         <w:t>Chapitre 3 : Conception</w:t>
       </w:r>
@@ -8201,7 +8204,7 @@
       <w:pPr>
         <w:pStyle w:val="Titre2"/>
       </w:pPr>
-      <w:bookmarkStart w:id="32" w:name="_Toc237211648"/>
+      <w:bookmarkStart w:id="32" w:name="_Toc237212568"/>
       <w:r>
         <w:t>3.1 Introduction</w:t>
       </w:r>
@@ -8216,7 +8219,7 @@
       <w:pPr>
         <w:pStyle w:val="Titre2"/>
       </w:pPr>
-      <w:bookmarkStart w:id="33" w:name="_Toc237211649"/>
+      <w:bookmarkStart w:id="33" w:name="_Toc237212569"/>
       <w:r>
         <w:t>3.2 Diagramme des paquetages</w:t>
       </w:r>
@@ -8268,7 +8271,7 @@
       <w:pPr>
         <w:pStyle w:val="Titre2"/>
       </w:pPr>
-      <w:bookmarkStart w:id="34" w:name="_Toc237211650"/>
+      <w:bookmarkStart w:id="34" w:name="_Toc237212570"/>
       <w:r>
         <w:t>3.3 Diagramme de classes global</w:t>
       </w:r>
@@ -8347,7 +8350,7 @@
       <w:pPr>
         <w:pStyle w:val="Titre2"/>
       </w:pPr>
-      <w:bookmarkStart w:id="35" w:name="_Toc237211651"/>
+      <w:bookmarkStart w:id="35" w:name="_Toc237212571"/>
       <w:r>
         <w:t>3.4 Diagrammes de séquence objet</w:t>
       </w:r>
@@ -8362,7 +8365,7 @@
       <w:pPr>
         <w:pStyle w:val="Titre3"/>
       </w:pPr>
-      <w:bookmarkStart w:id="36" w:name="_Toc237211652"/>
+      <w:bookmarkStart w:id="36" w:name="_Toc237212572"/>
       <w:r>
         <w:t>3.4.1 Planifier un entretien</w:t>
       </w:r>
@@ -8409,7 +8412,7 @@
       <w:pPr>
         <w:pStyle w:val="Titre3"/>
       </w:pPr>
-      <w:bookmarkStart w:id="37" w:name="_Toc237211653"/>
+      <w:bookmarkStart w:id="37" w:name="_Toc237212573"/>
       <w:r>
         <w:t>3.4.2 Décision finale de recrutement</w:t>
       </w:r>
@@ -8456,7 +8459,7 @@
       <w:pPr>
         <w:pStyle w:val="Titre2"/>
       </w:pPr>
-      <w:bookmarkStart w:id="38" w:name="_Toc237211654"/>
+      <w:bookmarkStart w:id="38" w:name="_Toc237212574"/>
       <w:r>
         <w:t>3.5 Diagramme d'états — Cycle de vie d'une candidature</w:t>
       </w:r>
@@ -8518,7 +8521,7 @@
       <w:pPr>
         <w:pStyle w:val="Titre2"/>
       </w:pPr>
-      <w:bookmarkStart w:id="39" w:name="_Toc237211655"/>
+      <w:bookmarkStart w:id="39" w:name="_Toc237212575"/>
       <w:r>
         <w:t>3.6 Conception de la base de données</w:t>
       </w:r>
@@ -8592,7 +8595,7 @@
       <w:pPr>
         <w:pStyle w:val="Titre2"/>
       </w:pPr>
-      <w:bookmarkStart w:id="40" w:name="_Toc237211656"/>
+      <w:bookmarkStart w:id="40" w:name="_Toc237212576"/>
       <w:r>
         <w:t>3.7 Diagramme de déploiement</w:t>
       </w:r>
@@ -8644,7 +8647,7 @@
       <w:pPr>
         <w:pStyle w:val="Titre2"/>
       </w:pPr>
-      <w:bookmarkStart w:id="41" w:name="_Toc237211657"/>
+      <w:bookmarkStart w:id="41" w:name="_Toc237212577"/>
       <w:r>
         <w:t>3.8 Diagramme de composants</w:t>
       </w:r>
@@ -8696,7 +8699,7 @@
       <w:pPr>
         <w:pStyle w:val="Titre2"/>
       </w:pPr>
-      <w:bookmarkStart w:id="42" w:name="_Toc237211658"/>
+      <w:bookmarkStart w:id="42" w:name="_Toc237212578"/>
       <w:r>
         <w:t>3.9 Conclusion</w:t>
       </w:r>
@@ -8719,7 +8722,7 @@
       <w:pPr>
         <w:pStyle w:val="Titre1"/>
       </w:pPr>
-      <w:bookmarkStart w:id="43" w:name="_Toc237211659"/>
+      <w:bookmarkStart w:id="43" w:name="_Toc237212579"/>
       <w:r>
         <w:t>Chapitre 4 : Réalisation</w:t>
       </w:r>
@@ -8734,7 +8737,7 @@
       <w:pPr>
         <w:pStyle w:val="Titre2"/>
       </w:pPr>
-      <w:bookmarkStart w:id="44" w:name="_Toc237211660"/>
+      <w:bookmarkStart w:id="44" w:name="_Toc237212580"/>
       <w:r>
         <w:t>4.1 Introduction</w:t>
       </w:r>
@@ -8749,7 +8752,7 @@
       <w:pPr>
         <w:pStyle w:val="Titre2"/>
       </w:pPr>
-      <w:bookmarkStart w:id="45" w:name="_Toc237211661"/>
+      <w:bookmarkStart w:id="45" w:name="_Toc237212581"/>
       <w:r>
         <w:t>4.2 Environnement de travail</w:t>
       </w:r>
@@ -8759,7 +8762,7 @@
       <w:pPr>
         <w:pStyle w:val="Titre3"/>
       </w:pPr>
-      <w:bookmarkStart w:id="46" w:name="_Toc237211662"/>
+      <w:bookmarkStart w:id="46" w:name="_Toc237212582"/>
       <w:r>
         <w:t>4.2.1 Environnement matériel</w:t>
       </w:r>
@@ -8774,7 +8777,7 @@
       <w:pPr>
         <w:pStyle w:val="Titre3"/>
       </w:pPr>
-      <w:bookmarkStart w:id="47" w:name="_Toc237211663"/>
+      <w:bookmarkStart w:id="47" w:name="_Toc237212583"/>
       <w:r>
         <w:t>4.2.2 Environnement logiciel</w:t>
       </w:r>
@@ -8897,7 +8900,7 @@
       <w:pPr>
         <w:pStyle w:val="Titre3"/>
       </w:pPr>
-      <w:bookmarkStart w:id="48" w:name="_Toc237211664"/>
+      <w:bookmarkStart w:id="48" w:name="_Toc237212584"/>
       <w:r>
         <w:t>4.2.3 Autres</w:t>
       </w:r>
@@ -8912,7 +8915,7 @@
       <w:pPr>
         <w:pStyle w:val="Titre3"/>
       </w:pPr>
-      <w:bookmarkStart w:id="49" w:name="_Toc237211665"/>
+      <w:bookmarkStart w:id="49" w:name="_Toc237212585"/>
       <w:r>
         <w:t>4.2.4 Sécurité applicative</w:t>
       </w:r>
@@ -8948,7 +8951,7 @@
       <w:pPr>
         <w:pStyle w:val="Titre2"/>
       </w:pPr>
-      <w:bookmarkStart w:id="50" w:name="_Toc237211666"/>
+      <w:bookmarkStart w:id="50" w:name="_Toc237212586"/>
       <w:r>
         <w:t>4.3 Interfaces graphiques de l'application</w:t>
       </w:r>
@@ -9370,7 +9373,7 @@
       <w:pPr>
         <w:pStyle w:val="Titre2"/>
       </w:pPr>
-      <w:bookmarkStart w:id="51" w:name="_Toc237211667"/>
+      <w:bookmarkStart w:id="51" w:name="_Toc237212587"/>
       <w:r>
         <w:t>4.4 Tests</w:t>
       </w:r>
@@ -9380,7 +9383,7 @@
       <w:pPr>
         <w:pStyle w:val="Titre3"/>
       </w:pPr>
-      <w:bookmarkStart w:id="52" w:name="_Toc237211668"/>
+      <w:bookmarkStart w:id="52" w:name="_Toc237212588"/>
       <w:r>
         <w:t>4.4.1 Tests unitaires (JUnit 5 / Mockito)</w:t>
       </w:r>
@@ -9627,7 +9630,7 @@
       <w:pPr>
         <w:pStyle w:val="Titre3"/>
       </w:pPr>
-      <w:bookmarkStart w:id="53" w:name="_Toc237211669"/>
+      <w:bookmarkStart w:id="53" w:name="_Toc237212589"/>
       <w:r>
         <w:t>4.4.2 Tests fonctionnels manuels</w:t>
       </w:r>
@@ -10540,7 +10543,7 @@
       <w:pPr>
         <w:pStyle w:val="Titre3"/>
       </w:pPr>
-      <w:bookmarkStart w:id="54" w:name="_Toc237211670"/>
+      <w:bookmarkStart w:id="54" w:name="_Toc237212590"/>
       <w:r>
         <w:t>4.4.3 Tests des API avec Postman et Swagger</w:t>
       </w:r>
@@ -10555,7 +10558,7 @@
       <w:pPr>
         <w:pStyle w:val="Titre3"/>
       </w:pPr>
-      <w:bookmarkStart w:id="55" w:name="_Toc237211671"/>
+      <w:bookmarkStart w:id="55" w:name="_Toc237212591"/>
       <w:r>
         <w:t>4.4.4 Vérification de bout en bout</w:t>
       </w:r>
@@ -10570,7 +10573,7 @@
       <w:pPr>
         <w:pStyle w:val="Titre2"/>
       </w:pPr>
-      <w:bookmarkStart w:id="56" w:name="_Toc237211672"/>
+      <w:bookmarkStart w:id="56" w:name="_Toc237212592"/>
       <w:r>
         <w:t>4.5 Difficultés rencontrées et solutions apportées</w:t>
       </w:r>
@@ -10591,7 +10594,7 @@
       <w:pPr>
         <w:pStyle w:val="Titre3"/>
       </w:pPr>
-      <w:bookmarkStart w:id="57" w:name="_Toc237211673"/>
+      <w:bookmarkStart w:id="57" w:name="_Toc237212593"/>
       <w:r>
         <w:t>4.5.1 Notification incomplète des managers</w:t>
       </w:r>
@@ -10609,7 +10612,7 @@
       <w:pPr>
         <w:pStyle w:val="Titre3"/>
       </w:pPr>
-      <w:bookmarkStart w:id="58" w:name="_Toc237211674"/>
+      <w:bookmarkStart w:id="58" w:name="_Toc237212594"/>
       <w:r>
         <w:t>4.5.2 Distinguer un rejet RH d'un rejet manager</w:t>
       </w:r>
@@ -10624,7 +10627,7 @@
       <w:pPr>
         <w:pStyle w:val="Titre3"/>
       </w:pPr>
-      <w:bookmarkStart w:id="59" w:name="_Toc237211675"/>
+      <w:bookmarkStart w:id="59" w:name="_Toc237212595"/>
       <w:r>
         <w:t>4.5.3 Cohérence des transitions de statut</w:t>
       </w:r>
@@ -10639,7 +10642,7 @@
       <w:pPr>
         <w:pStyle w:val="Titre3"/>
       </w:pPr>
-      <w:bookmarkStart w:id="60" w:name="_Toc237211676"/>
+      <w:bookmarkStart w:id="60" w:name="_Toc237212596"/>
       <w:r>
         <w:t>4.5.4 Filtrage incomplet des routes de lecture pour les managers</w:t>
       </w:r>
@@ -10654,7 +10657,7 @@
       <w:pPr>
         <w:pStyle w:val="Titre3"/>
       </w:pPr>
-      <w:bookmarkStart w:id="61" w:name="_Toc237211677"/>
+      <w:bookmarkStart w:id="61" w:name="_Toc237212597"/>
       <w:r>
         <w:t>4.5.5 Solliciter le manager au bon moment du processus</w:t>
       </w:r>
@@ -10672,7 +10675,7 @@
       <w:pPr>
         <w:pStyle w:val="Titre3"/>
       </w:pPr>
-      <w:bookmarkStart w:id="62" w:name="_Toc237211678"/>
+      <w:bookmarkStart w:id="62" w:name="_Toc237212598"/>
       <w:r>
         <w:t>4.5.6 Pertinence du matching Job idéal</w:t>
       </w:r>
@@ -10690,7 +10693,7 @@
       <w:pPr>
         <w:pStyle w:val="Titre3"/>
       </w:pPr>
-      <w:bookmarkStart w:id="63" w:name="_Toc237211679"/>
+      <w:bookmarkStart w:id="63" w:name="_Toc237212599"/>
       <w:r>
         <w:t>4.5.7 Traitement distinct des candidatures retirées</w:t>
       </w:r>
@@ -10708,7 +10711,7 @@
       <w:pPr>
         <w:pStyle w:val="Titre2"/>
       </w:pPr>
-      <w:bookmarkStart w:id="64" w:name="_Toc237211680"/>
+      <w:bookmarkStart w:id="64" w:name="_Toc237212600"/>
       <w:r>
         <w:t>4.6 Protection des données et éthique de l'IA</w:t>
       </w:r>
@@ -10724,7 +10727,7 @@
         <w:t xml:space="preserve">Le score attribué par l'agent d'intelligence artificielle constitue une aide à la présélection et non une décision autonome : comme détaillé au chapitre 3, un score insuffisant déclenche un rejet automatique, mais celui-ci reste réversible par un RH ou un Administrateur via le mécanisme de surcharge manuelle, avec justification obligatoire et traçabilité complète. Cette conception vise à limiter le risque d'erreur ou de biais algorithmique en conservant un contrôle humain sur toute décision affectant un candidat, dans l'esprit des </w:t>
       </w:r>
       <w:r>
-        <w:t>principes du RGPD [10] relatifs</w:t>
+        <w:t>principes du RGPD [9], [10] relatifs</w:t>
       </w:r>
       <w:r>
         <w:t xml:space="preserve"> aux décisions individuelles automatisées.</w:t>
@@ -10734,6 +10737,9 @@
       <w:r>
         <w:t>Ce dispositif présente néanmoins des limites qu'il convient d'assumer : la dépendance à un service d'IA externe (Cohere) et à sa disponibilité, la sensibilité du score à la qualité et à la structure du CV fourni, le risque de biais inhérent à tout modèle statistique, et l'absence volontaire de décision entièrement autonome, chaque rejet automatique restant réversible par un opérateur humain. Ces limites justifient le maintien systématique d'une validation humaine et une traçabilité complète des décisions prises.</w:t>
       </w:r>
+      <w:r>
+        <w:t xml:space="preserve"> La conception du processus de recrutement doit également prendre en compte les principes de diversité et d'inclusion afin de limiter les risques de discrimination dans les processus de sélection automatisés [14].</w:t>
+      </w:r>
     </w:p>
     <w:p>
       <w:r>
@@ -10744,7 +10750,7 @@
       <w:pPr>
         <w:pStyle w:val="Titre2"/>
       </w:pPr>
-      <w:bookmarkStart w:id="65" w:name="_Toc237211681"/>
+      <w:bookmarkStart w:id="65" w:name="_Toc237212601"/>
       <w:r>
         <w:t>4.7 Bilan des fonctionnalités réalisées</w:t>
       </w:r>
@@ -11269,7 +11275,7 @@
       <w:pPr>
         <w:pStyle w:val="Titre2"/>
       </w:pPr>
-      <w:bookmarkStart w:id="66" w:name="_Toc237211682"/>
+      <w:bookmarkStart w:id="66" w:name="_Toc237212602"/>
       <w:r>
         <w:t>4.8 Conclusion</w:t>
       </w:r>
@@ -11293,7 +11299,7 @@
         <w:pStyle w:val="Titre1"/>
         <w:jc w:val="center"/>
       </w:pPr>
-      <w:bookmarkStart w:id="67" w:name="_Toc237211683"/>
+      <w:bookmarkStart w:id="67" w:name="_Toc237212603"/>
       <w:r>
         <w:t>Conclusion Générale et Perspectives</w:t>
       </w:r>
@@ -11356,7 +11362,7 @@
       <w:pPr>
         <w:pStyle w:val="Titre1"/>
       </w:pPr>
-      <w:bookmarkStart w:id="68" w:name="_Toc237211684"/>
+      <w:bookmarkStart w:id="68" w:name="_Toc237212604"/>
       <w:r>
         <w:t>Bibliographie</w:t>
       </w:r>
@@ -11584,7 +11590,7 @@
       <w:pPr>
         <w:pStyle w:val="Titre1"/>
       </w:pPr>
-      <w:bookmarkStart w:id="69" w:name="_Toc237211685"/>
+      <w:bookmarkStart w:id="69" w:name="_Toc237212605"/>
       <w:r>
         <w:t>Glossaire</w:t>
       </w:r>

</xml_diff>